<commit_message>
Laba 6 otchet finalniy tolko nujno dobavit titulniki
</commit_message>
<xml_diff>
--- a/Отчет_ЛР6.docx
+++ b/Отчет_ЛР6.docx
@@ -1149,16 +1149,23 @@
     </w:p>
     <w:p>
       <w:pPr>
-        <w:spacing w:after="240"/>
-        <w:rPr>
+        <w:rPr>
+          <w:rFonts w:eastAsiaTheme="majorEastAsia" w:cs="Times New Roman"/>
+          <w:b/>
+          <w:bCs/>
+          <w:color w:val="000000" w:themeColor="text1"/>
+          <w:sz w:val="28"/>
+          <w:szCs w:val="28"/>
           <w:lang w:val="ru-RU"/>
         </w:rPr>
       </w:pPr>
       <w:r>
         <w:rPr>
-          <w:lang w:val="ru-RU"/>
-        </w:rPr>
-        <w:t>Рисунок 1 - Основные компоненты интерфейса приложения</w:t>
+          <w:rFonts w:cs="Times New Roman"/>
+          <w:color w:val="000000" w:themeColor="text1"/>
+          <w:lang w:val="ru-RU"/>
+        </w:rPr>
+        <w:br w:type="page"/>
       </w:r>
     </w:p>
     <w:p>
@@ -1167,6 +1174,1824 @@
         <w:rPr>
           <w:rFonts w:ascii="Times New Roman" w:hAnsi="Times New Roman" w:cs="Times New Roman"/>
           <w:color w:val="000000" w:themeColor="text1"/>
+        </w:rPr>
+      </w:pPr>
+      <w:r>
+        <w:rPr>
+          <w:noProof/>
+        </w:rPr>
+        <w:lastRenderedPageBreak/>
+        <mc:AlternateContent>
+          <mc:Choice Requires="wps">
+            <w:drawing>
+              <wp:anchor distT="0" distB="0" distL="114300" distR="114300" simplePos="0" relativeHeight="251677696" behindDoc="0" locked="0" layoutInCell="1" allowOverlap="1" wp14:anchorId="5DF69708" wp14:editId="580CED5D">
+                <wp:simplePos x="0" y="0"/>
+                <wp:positionH relativeFrom="page">
+                  <wp:posOffset>1638300</wp:posOffset>
+                </wp:positionH>
+                <wp:positionV relativeFrom="paragraph">
+                  <wp:posOffset>289560</wp:posOffset>
+                </wp:positionV>
+                <wp:extent cx="1362075" cy="290698"/>
+                <wp:effectExtent l="0" t="0" r="0" b="0"/>
+                <wp:wrapNone/>
+                <wp:docPr id="28" name="Надпись 28"/>
+                <wp:cNvGraphicFramePr/>
+                <a:graphic xmlns:a="http://schemas.openxmlformats.org/drawingml/2006/main">
+                  <a:graphicData uri="http://schemas.microsoft.com/office/word/2010/wordprocessingShape">
+                    <wps:wsp>
+                      <wps:cNvSpPr txBox="1"/>
+                      <wps:spPr>
+                        <a:xfrm>
+                          <a:off x="0" y="0"/>
+                          <a:ext cx="1362075" cy="290698"/>
+                        </a:xfrm>
+                        <a:prstGeom prst="rect">
+                          <a:avLst/>
+                        </a:prstGeom>
+                        <a:noFill/>
+                        <a:ln w="6350">
+                          <a:noFill/>
+                        </a:ln>
+                      </wps:spPr>
+                      <wps:txbx>
+                        <w:txbxContent>
+                          <w:p>
+                            <w:r>
+                              <w:rPr>
+                                <w:sz w:val="26"/>
+                                <w:szCs w:val="26"/>
+                              </w:rPr>
+                              <w:t>toolStripButton2</w:t>
+                            </w:r>
+                          </w:p>
+                        </w:txbxContent>
+                      </wps:txbx>
+                      <wps:bodyPr rot="0" spcFirstLastPara="0" vertOverflow="overflow" horzOverflow="overflow" vert="horz" wrap="square" lIns="91440" tIns="45720" rIns="91440" bIns="45720" numCol="1" spcCol="0" rtlCol="0" fromWordArt="0" anchor="t" anchorCtr="0" forceAA="0" compatLnSpc="1">
+                        <a:prstTxWarp prst="textNoShape">
+                          <a:avLst/>
+                        </a:prstTxWarp>
+                        <a:noAutofit/>
+                      </wps:bodyPr>
+                    </wps:wsp>
+                  </a:graphicData>
+                </a:graphic>
+                <wp14:sizeRelH relativeFrom="margin">
+                  <wp14:pctWidth>0</wp14:pctWidth>
+                </wp14:sizeRelH>
+                <wp14:sizeRelV relativeFrom="margin">
+                  <wp14:pctHeight>0</wp14:pctHeight>
+                </wp14:sizeRelV>
+              </wp:anchor>
+            </w:drawing>
+          </mc:Choice>
+          <mc:Fallback>
+            <w:pict>
+              <v:shapetype w14:anchorId="5DF69708" id="_x0000_t202" coordsize="21600,21600" o:spt="202" path="m,l,21600r21600,l21600,xe">
+                <v:stroke joinstyle="miter"/>
+                <v:path gradientshapeok="t" o:connecttype="rect"/>
+              </v:shapetype>
+              <v:shape id="Надпись 28" o:spid="_x0000_s1026" type="#_x0000_t202" style="position:absolute;margin-left:129pt;margin-top:22.8pt;width:107.25pt;height:22.9pt;z-index:251677696;visibility:visible;mso-wrap-style:square;mso-width-percent:0;mso-height-percent:0;mso-wrap-distance-left:9pt;mso-wrap-distance-top:0;mso-wrap-distance-right:9pt;mso-wrap-distance-bottom:0;mso-position-horizontal:absolute;mso-position-horizontal-relative:page;mso-position-vertical:absolute;mso-position-vertical-relative:text;mso-width-percent:0;mso-height-percent:0;mso-width-relative:margin;mso-height-relative:margin;v-text-anchor:top" o:gfxdata="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" filled="f" stroked="f" strokeweight=".5pt">
+                <v:textbox>
+                  <w:txbxContent>
+                    <w:p>
+                      <w:r>
+                        <w:rPr>
+                          <w:sz w:val="26"/>
+                          <w:szCs w:val="26"/>
+                        </w:rPr>
+                        <w:t>toolStripButton2</w:t>
+                      </w:r>
+                    </w:p>
+                  </w:txbxContent>
+                </v:textbox>
+                <w10:wrap anchorx="page"/>
+              </v:shape>
+            </w:pict>
+          </mc:Fallback>
+        </mc:AlternateContent>
+      </w:r>
+      <w:r>
+        <w:rPr>
+          <w:noProof/>
+        </w:rPr>
+        <mc:AlternateContent>
+          <mc:Choice Requires="wps">
+            <w:drawing>
+              <wp:anchor distT="0" distB="0" distL="114300" distR="114300" simplePos="0" relativeHeight="251673600" behindDoc="0" locked="0" layoutInCell="1" allowOverlap="1" wp14:anchorId="02FAF25D" wp14:editId="70308AA3">
+                <wp:simplePos x="0" y="0"/>
+                <wp:positionH relativeFrom="page">
+                  <wp:posOffset>180975</wp:posOffset>
+                </wp:positionH>
+                <wp:positionV relativeFrom="paragraph">
+                  <wp:posOffset>384810</wp:posOffset>
+                </wp:positionV>
+                <wp:extent cx="1313708" cy="495300"/>
+                <wp:effectExtent l="0" t="0" r="0" b="0"/>
+                <wp:wrapNone/>
+                <wp:docPr id="22" name="Надпись 22"/>
+                <wp:cNvGraphicFramePr/>
+                <a:graphic xmlns:a="http://schemas.openxmlformats.org/drawingml/2006/main">
+                  <a:graphicData uri="http://schemas.microsoft.com/office/word/2010/wordprocessingShape">
+                    <wps:wsp>
+                      <wps:cNvSpPr txBox="1"/>
+                      <wps:spPr>
+                        <a:xfrm>
+                          <a:off x="0" y="0"/>
+                          <a:ext cx="1313708" cy="495300"/>
+                        </a:xfrm>
+                        <a:prstGeom prst="rect">
+                          <a:avLst/>
+                        </a:prstGeom>
+                        <a:noFill/>
+                        <a:ln w="6350">
+                          <a:noFill/>
+                        </a:ln>
+                      </wps:spPr>
+                      <wps:txbx>
+                        <w:txbxContent>
+                          <w:p>
+                            <w:proofErr w:type="spellStart"/>
+                            <w:r>
+                              <w:rPr>
+                                <w:sz w:val="26"/>
+                                <w:szCs w:val="26"/>
+                              </w:rPr>
+                              <w:t>справкаToolStripMenuItem</w:t>
+                            </w:r>
+                            <w:proofErr w:type="spellEnd"/>
+                          </w:p>
+                        </w:txbxContent>
+                      </wps:txbx>
+                      <wps:bodyPr rot="0" spcFirstLastPara="0" vertOverflow="overflow" horzOverflow="overflow" vert="horz" wrap="square" lIns="91440" tIns="45720" rIns="91440" bIns="45720" numCol="1" spcCol="0" rtlCol="0" fromWordArt="0" anchor="t" anchorCtr="0" forceAA="0" compatLnSpc="1">
+                        <a:prstTxWarp prst="textNoShape">
+                          <a:avLst/>
+                        </a:prstTxWarp>
+                        <a:noAutofit/>
+                      </wps:bodyPr>
+                    </wps:wsp>
+                  </a:graphicData>
+                </a:graphic>
+                <wp14:sizeRelH relativeFrom="margin">
+                  <wp14:pctWidth>0</wp14:pctWidth>
+                </wp14:sizeRelH>
+                <wp14:sizeRelV relativeFrom="margin">
+                  <wp14:pctHeight>0</wp14:pctHeight>
+                </wp14:sizeRelV>
+              </wp:anchor>
+            </w:drawing>
+          </mc:Choice>
+          <mc:Fallback>
+            <w:pict>
+              <v:shape w14:anchorId="02FAF25D" id="Надпись 22" o:spid="_x0000_s1027" type="#_x0000_t202" style="position:absolute;margin-left:14.25pt;margin-top:30.3pt;width:103.45pt;height:39pt;z-index:251673600;visibility:visible;mso-wrap-style:square;mso-width-percent:0;mso-height-percent:0;mso-wrap-distance-left:9pt;mso-wrap-distance-top:0;mso-wrap-distance-right:9pt;mso-wrap-distance-bottom:0;mso-position-horizontal:absolute;mso-position-horizontal-relative:page;mso-position-vertical:absolute;mso-position-vertical-relative:text;mso-width-percent:0;mso-height-percent:0;mso-width-relative:margin;mso-height-relative:margin;v-text-anchor:top" o:gfxdata="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" filled="f" stroked="f" strokeweight=".5pt">
+                <v:textbox>
+                  <w:txbxContent>
+                    <w:p>
+                      <w:proofErr w:type="spellStart"/>
+                      <w:r>
+                        <w:rPr>
+                          <w:sz w:val="26"/>
+                          <w:szCs w:val="26"/>
+                        </w:rPr>
+                        <w:t>справкаToolStripMenuItem</w:t>
+                      </w:r>
+                      <w:proofErr w:type="spellEnd"/>
+                    </w:p>
+                  </w:txbxContent>
+                </v:textbox>
+                <w10:wrap anchorx="page"/>
+              </v:shape>
+            </w:pict>
+          </mc:Fallback>
+        </mc:AlternateContent>
+      </w:r>
+    </w:p>
+    <w:p>
+      <w:pPr>
+        <w:jc w:val="center"/>
+      </w:pPr>
+      <w:r>
+        <w:rPr>
+          <w:noProof/>
+        </w:rPr>
+        <mc:AlternateContent>
+          <mc:Choice Requires="wps">
+            <w:drawing>
+              <wp:anchor distT="0" distB="0" distL="114300" distR="114300" simplePos="0" relativeHeight="251680768" behindDoc="0" locked="0" layoutInCell="1" allowOverlap="1" wp14:anchorId="1143798B" wp14:editId="649A8A4F">
+                <wp:simplePos x="0" y="0"/>
+                <wp:positionH relativeFrom="page">
+                  <wp:posOffset>4438650</wp:posOffset>
+                </wp:positionH>
+                <wp:positionV relativeFrom="paragraph">
+                  <wp:posOffset>27940</wp:posOffset>
+                </wp:positionV>
+                <wp:extent cx="1323975" cy="290698"/>
+                <wp:effectExtent l="0" t="0" r="0" b="0"/>
+                <wp:wrapNone/>
+                <wp:docPr id="15" name="Надпись 15"/>
+                <wp:cNvGraphicFramePr/>
+                <a:graphic xmlns:a="http://schemas.openxmlformats.org/drawingml/2006/main">
+                  <a:graphicData uri="http://schemas.microsoft.com/office/word/2010/wordprocessingShape">
+                    <wps:wsp>
+                      <wps:cNvSpPr txBox="1"/>
+                      <wps:spPr>
+                        <a:xfrm>
+                          <a:off x="0" y="0"/>
+                          <a:ext cx="1323975" cy="290698"/>
+                        </a:xfrm>
+                        <a:prstGeom prst="rect">
+                          <a:avLst/>
+                        </a:prstGeom>
+                        <a:noFill/>
+                        <a:ln w="6350">
+                          <a:noFill/>
+                        </a:ln>
+                      </wps:spPr>
+                      <wps:txbx>
+                        <w:txbxContent>
+                          <w:p>
+                            <w:r>
+                              <w:rPr>
+                                <w:sz w:val="26"/>
+                                <w:szCs w:val="26"/>
+                              </w:rPr>
+                              <w:t>toolStripButton</w:t>
+                            </w:r>
+                            <w:r>
+                              <w:rPr>
+                                <w:sz w:val="26"/>
+                                <w:szCs w:val="26"/>
+                              </w:rPr>
+                              <w:t>4</w:t>
+                            </w:r>
+                          </w:p>
+                        </w:txbxContent>
+                      </wps:txbx>
+                      <wps:bodyPr rot="0" spcFirstLastPara="0" vertOverflow="overflow" horzOverflow="overflow" vert="horz" wrap="square" lIns="91440" tIns="45720" rIns="91440" bIns="45720" numCol="1" spcCol="0" rtlCol="0" fromWordArt="0" anchor="t" anchorCtr="0" forceAA="0" compatLnSpc="1">
+                        <a:prstTxWarp prst="textNoShape">
+                          <a:avLst/>
+                        </a:prstTxWarp>
+                        <a:noAutofit/>
+                      </wps:bodyPr>
+                    </wps:wsp>
+                  </a:graphicData>
+                </a:graphic>
+                <wp14:sizeRelH relativeFrom="margin">
+                  <wp14:pctWidth>0</wp14:pctWidth>
+                </wp14:sizeRelH>
+                <wp14:sizeRelV relativeFrom="margin">
+                  <wp14:pctHeight>0</wp14:pctHeight>
+                </wp14:sizeRelV>
+              </wp:anchor>
+            </w:drawing>
+          </mc:Choice>
+          <mc:Fallback>
+            <w:pict>
+              <v:shape w14:anchorId="1143798B" id="Надпись 15" o:spid="_x0000_s1028" type="#_x0000_t202" style="position:absolute;left:0;text-align:left;margin-left:349.5pt;margin-top:2.2pt;width:104.25pt;height:22.9pt;z-index:251680768;visibility:visible;mso-wrap-style:square;mso-width-percent:0;mso-height-percent:0;mso-wrap-distance-left:9pt;mso-wrap-distance-top:0;mso-wrap-distance-right:9pt;mso-wrap-distance-bottom:0;mso-position-horizontal:absolute;mso-position-horizontal-relative:page;mso-position-vertical:absolute;mso-position-vertical-relative:text;mso-width-percent:0;mso-height-percent:0;mso-width-relative:margin;mso-height-relative:margin;v-text-anchor:top" o:gfxdata="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" filled="f" stroked="f" strokeweight=".5pt">
+                <v:textbox>
+                  <w:txbxContent>
+                    <w:p>
+                      <w:r>
+                        <w:rPr>
+                          <w:sz w:val="26"/>
+                          <w:szCs w:val="26"/>
+                        </w:rPr>
+                        <w:t>toolStripButton</w:t>
+                      </w:r>
+                      <w:r>
+                        <w:rPr>
+                          <w:sz w:val="26"/>
+                          <w:szCs w:val="26"/>
+                        </w:rPr>
+                        <w:t>4</w:t>
+                      </w:r>
+                    </w:p>
+                  </w:txbxContent>
+                </v:textbox>
+                <w10:wrap anchorx="page"/>
+              </v:shape>
+            </w:pict>
+          </mc:Fallback>
+        </mc:AlternateContent>
+      </w:r>
+      <w:r>
+        <w:rPr>
+          <w:noProof/>
+        </w:rPr>
+        <mc:AlternateContent>
+          <mc:Choice Requires="wps">
+            <w:drawing>
+              <wp:anchor distT="0" distB="0" distL="114300" distR="114300" simplePos="0" relativeHeight="251679744" behindDoc="0" locked="0" layoutInCell="1" allowOverlap="1" wp14:anchorId="17B8D71D" wp14:editId="292121EB">
+                <wp:simplePos x="0" y="0"/>
+                <wp:positionH relativeFrom="page">
+                  <wp:posOffset>2952750</wp:posOffset>
+                </wp:positionH>
+                <wp:positionV relativeFrom="paragraph">
+                  <wp:posOffset>13335</wp:posOffset>
+                </wp:positionV>
+                <wp:extent cx="1323975" cy="290698"/>
+                <wp:effectExtent l="0" t="0" r="0" b="0"/>
+                <wp:wrapNone/>
+                <wp:docPr id="14" name="Надпись 14"/>
+                <wp:cNvGraphicFramePr/>
+                <a:graphic xmlns:a="http://schemas.openxmlformats.org/drawingml/2006/main">
+                  <a:graphicData uri="http://schemas.microsoft.com/office/word/2010/wordprocessingShape">
+                    <wps:wsp>
+                      <wps:cNvSpPr txBox="1"/>
+                      <wps:spPr>
+                        <a:xfrm>
+                          <a:off x="0" y="0"/>
+                          <a:ext cx="1323975" cy="290698"/>
+                        </a:xfrm>
+                        <a:prstGeom prst="rect">
+                          <a:avLst/>
+                        </a:prstGeom>
+                        <a:noFill/>
+                        <a:ln w="6350">
+                          <a:noFill/>
+                        </a:ln>
+                      </wps:spPr>
+                      <wps:txbx>
+                        <w:txbxContent>
+                          <w:p>
+                            <w:r>
+                              <w:rPr>
+                                <w:sz w:val="26"/>
+                                <w:szCs w:val="26"/>
+                              </w:rPr>
+                              <w:t>toolStripButton</w:t>
+                            </w:r>
+                            <w:r>
+                              <w:rPr>
+                                <w:sz w:val="26"/>
+                                <w:szCs w:val="26"/>
+                              </w:rPr>
+                              <w:t>3</w:t>
+                            </w:r>
+                          </w:p>
+                        </w:txbxContent>
+                      </wps:txbx>
+                      <wps:bodyPr rot="0" spcFirstLastPara="0" vertOverflow="overflow" horzOverflow="overflow" vert="horz" wrap="square" lIns="91440" tIns="45720" rIns="91440" bIns="45720" numCol="1" spcCol="0" rtlCol="0" fromWordArt="0" anchor="t" anchorCtr="0" forceAA="0" compatLnSpc="1">
+                        <a:prstTxWarp prst="textNoShape">
+                          <a:avLst/>
+                        </a:prstTxWarp>
+                        <a:noAutofit/>
+                      </wps:bodyPr>
+                    </wps:wsp>
+                  </a:graphicData>
+                </a:graphic>
+                <wp14:sizeRelH relativeFrom="margin">
+                  <wp14:pctWidth>0</wp14:pctWidth>
+                </wp14:sizeRelH>
+                <wp14:sizeRelV relativeFrom="margin">
+                  <wp14:pctHeight>0</wp14:pctHeight>
+                </wp14:sizeRelV>
+              </wp:anchor>
+            </w:drawing>
+          </mc:Choice>
+          <mc:Fallback>
+            <w:pict>
+              <v:shape w14:anchorId="17B8D71D" id="Надпись 14" o:spid="_x0000_s1029" type="#_x0000_t202" style="position:absolute;left:0;text-align:left;margin-left:232.5pt;margin-top:1.05pt;width:104.25pt;height:22.9pt;z-index:251679744;visibility:visible;mso-wrap-style:square;mso-width-percent:0;mso-height-percent:0;mso-wrap-distance-left:9pt;mso-wrap-distance-top:0;mso-wrap-distance-right:9pt;mso-wrap-distance-bottom:0;mso-position-horizontal:absolute;mso-position-horizontal-relative:page;mso-position-vertical:absolute;mso-position-vertical-relative:text;mso-width-percent:0;mso-height-percent:0;mso-width-relative:margin;mso-height-relative:margin;v-text-anchor:top" o:gfxdata="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" filled="f" stroked="f" strokeweight=".5pt">
+                <v:textbox>
+                  <w:txbxContent>
+                    <w:p>
+                      <w:r>
+                        <w:rPr>
+                          <w:sz w:val="26"/>
+                          <w:szCs w:val="26"/>
+                        </w:rPr>
+                        <w:t>toolStripButton</w:t>
+                      </w:r>
+                      <w:r>
+                        <w:rPr>
+                          <w:sz w:val="26"/>
+                          <w:szCs w:val="26"/>
+                        </w:rPr>
+                        <w:t>3</w:t>
+                      </w:r>
+                    </w:p>
+                  </w:txbxContent>
+                </v:textbox>
+                <w10:wrap anchorx="page"/>
+              </v:shape>
+            </w:pict>
+          </mc:Fallback>
+        </mc:AlternateContent>
+      </w:r>
+    </w:p>
+    <w:p>
+      <w:pPr>
+        <w:jc w:val="center"/>
+      </w:pPr>
+      <w:r>
+        <w:rPr>
+          <w:noProof/>
+        </w:rPr>
+        <mc:AlternateContent>
+          <mc:Choice Requires="wps">
+            <w:drawing>
+              <wp:anchor distT="0" distB="0" distL="114300" distR="114300" simplePos="0" relativeHeight="251669504" behindDoc="0" locked="0" layoutInCell="1" allowOverlap="1" wp14:anchorId="771EF88E" wp14:editId="7A3244A9">
+                <wp:simplePos x="0" y="0"/>
+                <wp:positionH relativeFrom="margin">
+                  <wp:posOffset>3291841</wp:posOffset>
+                </wp:positionH>
+                <wp:positionV relativeFrom="paragraph">
+                  <wp:posOffset>32385</wp:posOffset>
+                </wp:positionV>
+                <wp:extent cx="438150" cy="790575"/>
+                <wp:effectExtent l="0" t="0" r="19050" b="28575"/>
+                <wp:wrapNone/>
+                <wp:docPr id="12" name="Прямая соединительная линия 12"/>
+                <wp:cNvGraphicFramePr/>
+                <a:graphic xmlns:a="http://schemas.openxmlformats.org/drawingml/2006/main">
+                  <a:graphicData uri="http://schemas.microsoft.com/office/word/2010/wordprocessingShape">
+                    <wps:wsp>
+                      <wps:cNvCnPr/>
+                      <wps:spPr>
+                        <a:xfrm flipV="1">
+                          <a:off x="0" y="0"/>
+                          <a:ext cx="438150" cy="790575"/>
+                        </a:xfrm>
+                        <a:prstGeom prst="line">
+                          <a:avLst/>
+                        </a:prstGeom>
+                      </wps:spPr>
+                      <wps:style>
+                        <a:lnRef idx="1">
+                          <a:schemeClr val="dk1"/>
+                        </a:lnRef>
+                        <a:fillRef idx="0">
+                          <a:schemeClr val="dk1"/>
+                        </a:fillRef>
+                        <a:effectRef idx="0">
+                          <a:schemeClr val="dk1"/>
+                        </a:effectRef>
+                        <a:fontRef idx="minor">
+                          <a:schemeClr val="tx1"/>
+                        </a:fontRef>
+                      </wps:style>
+                      <wps:bodyPr/>
+                    </wps:wsp>
+                  </a:graphicData>
+                </a:graphic>
+                <wp14:sizeRelH relativeFrom="margin">
+                  <wp14:pctWidth>0</wp14:pctWidth>
+                </wp14:sizeRelH>
+                <wp14:sizeRelV relativeFrom="margin">
+                  <wp14:pctHeight>0</wp14:pctHeight>
+                </wp14:sizeRelV>
+              </wp:anchor>
+            </w:drawing>
+          </mc:Choice>
+          <mc:Fallback>
+            <w:pict>
+              <v:line w14:anchorId="752B6F7E" id="Прямая соединительная линия 12" o:spid="_x0000_s1026" style="position:absolute;flip:y;z-index:251669504;visibility:visible;mso-wrap-style:square;mso-width-percent:0;mso-height-percent:0;mso-wrap-distance-left:9pt;mso-wrap-distance-top:0;mso-wrap-distance-right:9pt;mso-wrap-distance-bottom:0;mso-position-horizontal:absolute;mso-position-horizontal-relative:margin;mso-position-vertical:absolute;mso-position-vertical-relative:text;mso-width-percent:0;mso-height-percent:0;mso-width-relative:margin;mso-height-relative:margin" from="259.2pt,2.55pt" to="293.7pt,64.8pt" o:gfxdata="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" strokecolor="black [3040]">
+                <w10:wrap anchorx="margin"/>
+              </v:line>
+            </w:pict>
+          </mc:Fallback>
+        </mc:AlternateContent>
+      </w:r>
+      <w:r>
+        <w:rPr>
+          <w:noProof/>
+        </w:rPr>
+        <mc:AlternateContent>
+          <mc:Choice Requires="wps">
+            <w:drawing>
+              <wp:anchor distT="0" distB="0" distL="114300" distR="114300" simplePos="0" relativeHeight="251676672" behindDoc="0" locked="0" layoutInCell="1" allowOverlap="1" wp14:anchorId="758108F1" wp14:editId="72410800">
+                <wp:simplePos x="0" y="0"/>
+                <wp:positionH relativeFrom="margin">
+                  <wp:posOffset>2148840</wp:posOffset>
+                </wp:positionH>
+                <wp:positionV relativeFrom="paragraph">
+                  <wp:posOffset>22859</wp:posOffset>
+                </wp:positionV>
+                <wp:extent cx="304800" cy="800100"/>
+                <wp:effectExtent l="0" t="0" r="19050" b="19050"/>
+                <wp:wrapNone/>
+                <wp:docPr id="27" name="Прямая соединительная линия 27"/>
+                <wp:cNvGraphicFramePr/>
+                <a:graphic xmlns:a="http://schemas.openxmlformats.org/drawingml/2006/main">
+                  <a:graphicData uri="http://schemas.microsoft.com/office/word/2010/wordprocessingShape">
+                    <wps:wsp>
+                      <wps:cNvCnPr/>
+                      <wps:spPr>
+                        <a:xfrm flipH="1" flipV="1">
+                          <a:off x="0" y="0"/>
+                          <a:ext cx="304800" cy="800100"/>
+                        </a:xfrm>
+                        <a:prstGeom prst="line">
+                          <a:avLst/>
+                        </a:prstGeom>
+                      </wps:spPr>
+                      <wps:style>
+                        <a:lnRef idx="1">
+                          <a:schemeClr val="dk1"/>
+                        </a:lnRef>
+                        <a:fillRef idx="0">
+                          <a:schemeClr val="dk1"/>
+                        </a:fillRef>
+                        <a:effectRef idx="0">
+                          <a:schemeClr val="dk1"/>
+                        </a:effectRef>
+                        <a:fontRef idx="minor">
+                          <a:schemeClr val="tx1"/>
+                        </a:fontRef>
+                      </wps:style>
+                      <wps:bodyPr/>
+                    </wps:wsp>
+                  </a:graphicData>
+                </a:graphic>
+                <wp14:sizeRelH relativeFrom="margin">
+                  <wp14:pctWidth>0</wp14:pctWidth>
+                </wp14:sizeRelH>
+                <wp14:sizeRelV relativeFrom="margin">
+                  <wp14:pctHeight>0</wp14:pctHeight>
+                </wp14:sizeRelV>
+              </wp:anchor>
+            </w:drawing>
+          </mc:Choice>
+          <mc:Fallback>
+            <w:pict>
+              <v:line w14:anchorId="10AE9E55" id="Прямая соединительная линия 27" o:spid="_x0000_s1026" style="position:absolute;flip:x y;z-index:251676672;visibility:visible;mso-wrap-style:square;mso-width-percent:0;mso-height-percent:0;mso-wrap-distance-left:9pt;mso-wrap-distance-top:0;mso-wrap-distance-right:9pt;mso-wrap-distance-bottom:0;mso-position-horizontal:absolute;mso-position-horizontal-relative:margin;mso-position-vertical:absolute;mso-position-vertical-relative:text;mso-width-percent:0;mso-height-percent:0;mso-width-relative:margin;mso-height-relative:margin" from="169.2pt,1.8pt" to="193.2pt,64.8pt" o:gfxdata="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" strokecolor="black [3040]">
+                <w10:wrap anchorx="margin"/>
+              </v:line>
+            </w:pict>
+          </mc:Fallback>
+        </mc:AlternateContent>
+      </w:r>
+      <w:r>
+        <w:rPr>
+          <w:noProof/>
+        </w:rPr>
+        <mc:AlternateContent>
+          <mc:Choice Requires="wps">
+            <w:drawing>
+              <wp:anchor distT="0" distB="0" distL="114300" distR="114300" simplePos="0" relativeHeight="251674624" behindDoc="0" locked="0" layoutInCell="1" allowOverlap="1" wp14:anchorId="43DCCAFB" wp14:editId="0863D714">
+                <wp:simplePos x="0" y="0"/>
+                <wp:positionH relativeFrom="margin">
+                  <wp:posOffset>1215390</wp:posOffset>
+                </wp:positionH>
+                <wp:positionV relativeFrom="paragraph">
+                  <wp:posOffset>13334</wp:posOffset>
+                </wp:positionV>
+                <wp:extent cx="476250" cy="800100"/>
+                <wp:effectExtent l="0" t="0" r="19050" b="19050"/>
+                <wp:wrapNone/>
+                <wp:docPr id="25" name="Прямая соединительная линия 25"/>
+                <wp:cNvGraphicFramePr/>
+                <a:graphic xmlns:a="http://schemas.openxmlformats.org/drawingml/2006/main">
+                  <a:graphicData uri="http://schemas.microsoft.com/office/word/2010/wordprocessingShape">
+                    <wps:wsp>
+                      <wps:cNvCnPr/>
+                      <wps:spPr>
+                        <a:xfrm flipH="1" flipV="1">
+                          <a:off x="0" y="0"/>
+                          <a:ext cx="476250" cy="800100"/>
+                        </a:xfrm>
+                        <a:prstGeom prst="line">
+                          <a:avLst/>
+                        </a:prstGeom>
+                      </wps:spPr>
+                      <wps:style>
+                        <a:lnRef idx="1">
+                          <a:schemeClr val="dk1"/>
+                        </a:lnRef>
+                        <a:fillRef idx="0">
+                          <a:schemeClr val="dk1"/>
+                        </a:fillRef>
+                        <a:effectRef idx="0">
+                          <a:schemeClr val="dk1"/>
+                        </a:effectRef>
+                        <a:fontRef idx="minor">
+                          <a:schemeClr val="tx1"/>
+                        </a:fontRef>
+                      </wps:style>
+                      <wps:bodyPr/>
+                    </wps:wsp>
+                  </a:graphicData>
+                </a:graphic>
+                <wp14:sizeRelH relativeFrom="margin">
+                  <wp14:pctWidth>0</wp14:pctWidth>
+                </wp14:sizeRelH>
+                <wp14:sizeRelV relativeFrom="margin">
+                  <wp14:pctHeight>0</wp14:pctHeight>
+                </wp14:sizeRelV>
+              </wp:anchor>
+            </w:drawing>
+          </mc:Choice>
+          <mc:Fallback>
+            <w:pict>
+              <v:line w14:anchorId="45AB77C4" id="Прямая соединительная линия 25" o:spid="_x0000_s1026" style="position:absolute;flip:x y;z-index:251674624;visibility:visible;mso-wrap-style:square;mso-width-percent:0;mso-height-percent:0;mso-wrap-distance-left:9pt;mso-wrap-distance-top:0;mso-wrap-distance-right:9pt;mso-wrap-distance-bottom:0;mso-position-horizontal:absolute;mso-position-horizontal-relative:margin;mso-position-vertical:absolute;mso-position-vertical-relative:text;mso-width-percent:0;mso-height-percent:0;mso-width-relative:margin;mso-height-relative:margin" from="95.7pt,1.05pt" to="133.2pt,64.05pt" o:gfxdata="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" strokecolor="black [3040]">
+                <w10:wrap anchorx="margin"/>
+              </v:line>
+            </w:pict>
+          </mc:Fallback>
+        </mc:AlternateContent>
+      </w:r>
+      <w:r>
+        <w:rPr>
+          <w:noProof/>
+        </w:rPr>
+        <mc:AlternateContent>
+          <mc:Choice Requires="wps">
+            <w:drawing>
+              <wp:anchor distT="0" distB="0" distL="114300" distR="114300" simplePos="0" relativeHeight="251668480" behindDoc="0" locked="0" layoutInCell="1" allowOverlap="1" wp14:anchorId="793ED036" wp14:editId="79C69F6D">
+                <wp:simplePos x="0" y="0"/>
+                <wp:positionH relativeFrom="leftMargin">
+                  <wp:posOffset>-34290</wp:posOffset>
+                </wp:positionH>
+                <wp:positionV relativeFrom="paragraph">
+                  <wp:posOffset>384810</wp:posOffset>
+                </wp:positionV>
+                <wp:extent cx="1085850" cy="742950"/>
+                <wp:effectExtent l="0" t="0" r="0" b="0"/>
+                <wp:wrapNone/>
+                <wp:docPr id="11" name="Надпись 11"/>
+                <wp:cNvGraphicFramePr/>
+                <a:graphic xmlns:a="http://schemas.openxmlformats.org/drawingml/2006/main">
+                  <a:graphicData uri="http://schemas.microsoft.com/office/word/2010/wordprocessingShape">
+                    <wps:wsp>
+                      <wps:cNvSpPr txBox="1"/>
+                      <wps:spPr>
+                        <a:xfrm>
+                          <a:off x="0" y="0"/>
+                          <a:ext cx="1085850" cy="742950"/>
+                        </a:xfrm>
+                        <a:prstGeom prst="rect">
+                          <a:avLst/>
+                        </a:prstGeom>
+                        <a:noFill/>
+                        <a:ln w="6350">
+                          <a:noFill/>
+                        </a:ln>
+                      </wps:spPr>
+                      <wps:txbx>
+                        <w:txbxContent>
+                          <w:p>
+                            <w:pPr>
+                              <w:rPr>
+                                <w:sz w:val="26"/>
+                                <w:szCs w:val="26"/>
+                              </w:rPr>
+                            </w:pPr>
+                            <w:proofErr w:type="spellStart"/>
+                            <w:r>
+                              <w:rPr>
+                                <w:sz w:val="26"/>
+                                <w:szCs w:val="26"/>
+                              </w:rPr>
+                              <w:t>расчетToolStripMenuItem</w:t>
+                            </w:r>
+                            <w:proofErr w:type="spellEnd"/>
+                          </w:p>
+                        </w:txbxContent>
+                      </wps:txbx>
+                      <wps:bodyPr rot="0" spcFirstLastPara="0" vertOverflow="overflow" horzOverflow="overflow" vert="horz" wrap="square" lIns="91440" tIns="45720" rIns="91440" bIns="45720" numCol="1" spcCol="0" rtlCol="0" fromWordArt="0" anchor="t" anchorCtr="0" forceAA="0" compatLnSpc="1">
+                        <a:prstTxWarp prst="textNoShape">
+                          <a:avLst/>
+                        </a:prstTxWarp>
+                        <a:noAutofit/>
+                      </wps:bodyPr>
+                    </wps:wsp>
+                  </a:graphicData>
+                </a:graphic>
+                <wp14:sizeRelH relativeFrom="margin">
+                  <wp14:pctWidth>0</wp14:pctWidth>
+                </wp14:sizeRelH>
+                <wp14:sizeRelV relativeFrom="margin">
+                  <wp14:pctHeight>0</wp14:pctHeight>
+                </wp14:sizeRelV>
+              </wp:anchor>
+            </w:drawing>
+          </mc:Choice>
+          <mc:Fallback>
+            <w:pict>
+              <v:shape w14:anchorId="793ED036" id="Надпись 11" o:spid="_x0000_s1030" type="#_x0000_t202" style="position:absolute;left:0;text-align:left;margin-left:-2.7pt;margin-top:30.3pt;width:85.5pt;height:58.5pt;z-index:251668480;visibility:visible;mso-wrap-style:square;mso-width-percent:0;mso-height-percent:0;mso-wrap-distance-left:9pt;mso-wrap-distance-top:0;mso-wrap-distance-right:9pt;mso-wrap-distance-bottom:0;mso-position-horizontal:absolute;mso-position-horizontal-relative:left-margin-area;mso-position-vertical:absolute;mso-position-vertical-relative:text;mso-width-percent:0;mso-height-percent:0;mso-width-relative:margin;mso-height-relative:margin;v-text-anchor:top" o:gfxdata="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" filled="f" stroked="f" strokeweight=".5pt">
+                <v:textbox>
+                  <w:txbxContent>
+                    <w:p>
+                      <w:pPr>
+                        <w:rPr>
+                          <w:sz w:val="26"/>
+                          <w:szCs w:val="26"/>
+                        </w:rPr>
+                      </w:pPr>
+                      <w:proofErr w:type="spellStart"/>
+                      <w:r>
+                        <w:rPr>
+                          <w:sz w:val="26"/>
+                          <w:szCs w:val="26"/>
+                        </w:rPr>
+                        <w:t>расчетToolStripMenuItem</w:t>
+                      </w:r>
+                      <w:proofErr w:type="spellEnd"/>
+                    </w:p>
+                  </w:txbxContent>
+                </v:textbox>
+                <w10:wrap anchorx="margin"/>
+              </v:shape>
+            </w:pict>
+          </mc:Fallback>
+        </mc:AlternateContent>
+      </w:r>
+      <w:r>
+        <w:rPr>
+          <w:noProof/>
+        </w:rPr>
+        <mc:AlternateContent>
+          <mc:Choice Requires="wps">
+            <w:drawing>
+              <wp:anchor distT="0" distB="0" distL="114300" distR="114300" simplePos="0" relativeHeight="251672576" behindDoc="0" locked="0" layoutInCell="1" allowOverlap="1" wp14:anchorId="53DF0385" wp14:editId="2D96E6F3">
+                <wp:simplePos x="0" y="0"/>
+                <wp:positionH relativeFrom="margin">
+                  <wp:posOffset>262890</wp:posOffset>
+                </wp:positionH>
+                <wp:positionV relativeFrom="paragraph">
+                  <wp:posOffset>70484</wp:posOffset>
+                </wp:positionV>
+                <wp:extent cx="695325" cy="523875"/>
+                <wp:effectExtent l="0" t="0" r="28575" b="28575"/>
+                <wp:wrapNone/>
+                <wp:docPr id="21" name="Прямая соединительная линия 21"/>
+                <wp:cNvGraphicFramePr/>
+                <a:graphic xmlns:a="http://schemas.openxmlformats.org/drawingml/2006/main">
+                  <a:graphicData uri="http://schemas.microsoft.com/office/word/2010/wordprocessingShape">
+                    <wps:wsp>
+                      <wps:cNvCnPr/>
+                      <wps:spPr>
+                        <a:xfrm flipH="1" flipV="1">
+                          <a:off x="0" y="0"/>
+                          <a:ext cx="695325" cy="523875"/>
+                        </a:xfrm>
+                        <a:prstGeom prst="line">
+                          <a:avLst/>
+                        </a:prstGeom>
+                      </wps:spPr>
+                      <wps:style>
+                        <a:lnRef idx="1">
+                          <a:schemeClr val="dk1"/>
+                        </a:lnRef>
+                        <a:fillRef idx="0">
+                          <a:schemeClr val="dk1"/>
+                        </a:fillRef>
+                        <a:effectRef idx="0">
+                          <a:schemeClr val="dk1"/>
+                        </a:effectRef>
+                        <a:fontRef idx="minor">
+                          <a:schemeClr val="tx1"/>
+                        </a:fontRef>
+                      </wps:style>
+                      <wps:bodyPr/>
+                    </wps:wsp>
+                  </a:graphicData>
+                </a:graphic>
+                <wp14:sizeRelH relativeFrom="margin">
+                  <wp14:pctWidth>0</wp14:pctWidth>
+                </wp14:sizeRelH>
+                <wp14:sizeRelV relativeFrom="margin">
+                  <wp14:pctHeight>0</wp14:pctHeight>
+                </wp14:sizeRelV>
+              </wp:anchor>
+            </w:drawing>
+          </mc:Choice>
+          <mc:Fallback>
+            <w:pict>
+              <v:line w14:anchorId="29CA1C39" id="Прямая соединительная линия 21" o:spid="_x0000_s1026" style="position:absolute;flip:x y;z-index:251672576;visibility:visible;mso-wrap-style:square;mso-width-percent:0;mso-height-percent:0;mso-wrap-distance-left:9pt;mso-wrap-distance-top:0;mso-wrap-distance-right:9pt;mso-wrap-distance-bottom:0;mso-position-horizontal:absolute;mso-position-horizontal-relative:margin;mso-position-vertical:absolute;mso-position-vertical-relative:text;mso-width-percent:0;mso-height-percent:0;mso-width-relative:margin;mso-height-relative:margin" from="20.7pt,5.55pt" to="75.45pt,46.8pt" o:gfxdata="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" strokecolor="black [3040]">
+                <w10:wrap anchorx="margin"/>
+              </v:line>
+            </w:pict>
+          </mc:Fallback>
+        </mc:AlternateContent>
+      </w:r>
+    </w:p>
+    <w:p>
+      <w:pPr>
+        <w:jc w:val="center"/>
+      </w:pPr>
+      <w:r>
+        <w:rPr>
+          <w:noProof/>
+        </w:rPr>
+        <mc:AlternateContent>
+          <mc:Choice Requires="wps">
+            <w:drawing>
+              <wp:anchor distT="0" distB="0" distL="114300" distR="114300" simplePos="0" relativeHeight="251659264" behindDoc="0" locked="0" layoutInCell="1" allowOverlap="1" wp14:anchorId="1126C5C2" wp14:editId="177D4FE9">
+                <wp:simplePos x="0" y="0"/>
+                <wp:positionH relativeFrom="column">
+                  <wp:posOffset>-137160</wp:posOffset>
+                </wp:positionH>
+                <wp:positionV relativeFrom="paragraph">
+                  <wp:posOffset>2700019</wp:posOffset>
+                </wp:positionV>
+                <wp:extent cx="1343025" cy="66675"/>
+                <wp:effectExtent l="0" t="0" r="28575" b="28575"/>
+                <wp:wrapNone/>
+                <wp:docPr id="4" name="Прямая соединительная линия 4"/>
+                <wp:cNvGraphicFramePr/>
+                <a:graphic xmlns:a="http://schemas.openxmlformats.org/drawingml/2006/main">
+                  <a:graphicData uri="http://schemas.microsoft.com/office/word/2010/wordprocessingShape">
+                    <wps:wsp>
+                      <wps:cNvCnPr/>
+                      <wps:spPr>
+                        <a:xfrm>
+                          <a:off x="0" y="0"/>
+                          <a:ext cx="1343025" cy="66675"/>
+                        </a:xfrm>
+                        <a:prstGeom prst="line">
+                          <a:avLst/>
+                        </a:prstGeom>
+                      </wps:spPr>
+                      <wps:style>
+                        <a:lnRef idx="1">
+                          <a:schemeClr val="dk1"/>
+                        </a:lnRef>
+                        <a:fillRef idx="0">
+                          <a:schemeClr val="dk1"/>
+                        </a:fillRef>
+                        <a:effectRef idx="0">
+                          <a:schemeClr val="dk1"/>
+                        </a:effectRef>
+                        <a:fontRef idx="minor">
+                          <a:schemeClr val="tx1"/>
+                        </a:fontRef>
+                      </wps:style>
+                      <wps:bodyPr/>
+                    </wps:wsp>
+                  </a:graphicData>
+                </a:graphic>
+                <wp14:sizeRelH relativeFrom="margin">
+                  <wp14:pctWidth>0</wp14:pctWidth>
+                </wp14:sizeRelH>
+                <wp14:sizeRelV relativeFrom="margin">
+                  <wp14:pctHeight>0</wp14:pctHeight>
+                </wp14:sizeRelV>
+              </wp:anchor>
+            </w:drawing>
+          </mc:Choice>
+          <mc:Fallback>
+            <w:pict>
+              <v:line w14:anchorId="4FC3351E" id="Прямая соединительная линия 4" o:spid="_x0000_s1026" style="position:absolute;z-index:251659264;visibility:visible;mso-wrap-style:square;mso-width-percent:0;mso-height-percent:0;mso-wrap-distance-left:9pt;mso-wrap-distance-top:0;mso-wrap-distance-right:9pt;mso-wrap-distance-bottom:0;mso-position-horizontal:absolute;mso-position-horizontal-relative:text;mso-position-vertical:absolute;mso-position-vertical-relative:text;mso-width-percent:0;mso-height-percent:0;mso-width-relative:margin;mso-height-relative:margin" from="-10.8pt,212.6pt" to="94.95pt,217.85pt" o:gfxdata="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" strokecolor="black [3040]"/>
+            </w:pict>
+          </mc:Fallback>
+        </mc:AlternateContent>
+      </w:r>
+      <w:r>
+        <w:rPr>
+          <w:noProof/>
+        </w:rPr>
+        <mc:AlternateContent>
+          <mc:Choice Requires="wps">
+            <w:drawing>
+              <wp:anchor distT="0" distB="0" distL="114300" distR="114300" simplePos="0" relativeHeight="251660288" behindDoc="0" locked="0" layoutInCell="1" allowOverlap="1" wp14:anchorId="3D6F6C78" wp14:editId="76A114BA">
+                <wp:simplePos x="0" y="0"/>
+                <wp:positionH relativeFrom="leftMargin">
+                  <wp:posOffset>419100</wp:posOffset>
+                </wp:positionH>
+                <wp:positionV relativeFrom="paragraph">
+                  <wp:posOffset>2585720</wp:posOffset>
+                </wp:positionV>
+                <wp:extent cx="752475" cy="361950"/>
+                <wp:effectExtent l="0" t="0" r="0" b="0"/>
+                <wp:wrapNone/>
+                <wp:docPr id="6" name="Надпись 6"/>
+                <wp:cNvGraphicFramePr/>
+                <a:graphic xmlns:a="http://schemas.openxmlformats.org/drawingml/2006/main">
+                  <a:graphicData uri="http://schemas.microsoft.com/office/word/2010/wordprocessingShape">
+                    <wps:wsp>
+                      <wps:cNvSpPr txBox="1"/>
+                      <wps:spPr>
+                        <a:xfrm>
+                          <a:off x="0" y="0"/>
+                          <a:ext cx="752475" cy="361950"/>
+                        </a:xfrm>
+                        <a:prstGeom prst="rect">
+                          <a:avLst/>
+                        </a:prstGeom>
+                        <a:noFill/>
+                        <a:ln w="6350">
+                          <a:noFill/>
+                        </a:ln>
+                      </wps:spPr>
+                      <wps:txbx>
+                        <w:txbxContent>
+                          <w:p>
+                            <w:r>
+                              <w:t>Label4</w:t>
+                            </w:r>
+                          </w:p>
+                        </w:txbxContent>
+                      </wps:txbx>
+                      <wps:bodyPr rot="0" spcFirstLastPara="0" vertOverflow="overflow" horzOverflow="overflow" vert="horz" wrap="square" lIns="91440" tIns="45720" rIns="91440" bIns="45720" numCol="1" spcCol="0" rtlCol="0" fromWordArt="0" anchor="t" anchorCtr="0" forceAA="0" compatLnSpc="1">
+                        <a:prstTxWarp prst="textNoShape">
+                          <a:avLst/>
+                        </a:prstTxWarp>
+                        <a:noAutofit/>
+                      </wps:bodyPr>
+                    </wps:wsp>
+                  </a:graphicData>
+                </a:graphic>
+                <wp14:sizeRelH relativeFrom="margin">
+                  <wp14:pctWidth>0</wp14:pctWidth>
+                </wp14:sizeRelH>
+                <wp14:sizeRelV relativeFrom="margin">
+                  <wp14:pctHeight>0</wp14:pctHeight>
+                </wp14:sizeRelV>
+              </wp:anchor>
+            </w:drawing>
+          </mc:Choice>
+          <mc:Fallback>
+            <w:pict>
+              <v:shape w14:anchorId="3D6F6C78" id="Надпись 6" o:spid="_x0000_s1031" type="#_x0000_t202" style="position:absolute;left:0;text-align:left;margin-left:33pt;margin-top:203.6pt;width:59.25pt;height:28.5pt;z-index:251660288;visibility:visible;mso-wrap-style:square;mso-width-percent:0;mso-height-percent:0;mso-wrap-distance-left:9pt;mso-wrap-distance-top:0;mso-wrap-distance-right:9pt;mso-wrap-distance-bottom:0;mso-position-horizontal:absolute;mso-position-horizontal-relative:left-margin-area;mso-position-vertical:absolute;mso-position-vertical-relative:text;mso-width-percent:0;mso-height-percent:0;mso-width-relative:margin;mso-height-relative:margin;v-text-anchor:top" o:gfxdata="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" filled="f" stroked="f" strokeweight=".5pt">
+                <v:textbox>
+                  <w:txbxContent>
+                    <w:p>
+                      <w:r>
+                        <w:t>Label4</w:t>
+                      </w:r>
+                    </w:p>
+                  </w:txbxContent>
+                </v:textbox>
+                <w10:wrap anchorx="margin"/>
+              </v:shape>
+            </w:pict>
+          </mc:Fallback>
+        </mc:AlternateContent>
+      </w:r>
+      <w:r>
+        <w:rPr>
+          <w:noProof/>
+        </w:rPr>
+        <mc:AlternateContent>
+          <mc:Choice Requires="wps">
+            <w:drawing>
+              <wp:anchor distT="0" distB="0" distL="114300" distR="114300" simplePos="0" relativeHeight="251661312" behindDoc="0" locked="0" layoutInCell="1" allowOverlap="1" wp14:anchorId="1CA51B4F" wp14:editId="0515635E">
+                <wp:simplePos x="0" y="0"/>
+                <wp:positionH relativeFrom="column">
+                  <wp:posOffset>2672714</wp:posOffset>
+                </wp:positionH>
+                <wp:positionV relativeFrom="paragraph">
+                  <wp:posOffset>2728594</wp:posOffset>
+                </wp:positionV>
+                <wp:extent cx="2905125" cy="28575"/>
+                <wp:effectExtent l="0" t="0" r="28575" b="28575"/>
+                <wp:wrapNone/>
+                <wp:docPr id="5" name="Прямая соединительная линия 5"/>
+                <wp:cNvGraphicFramePr/>
+                <a:graphic xmlns:a="http://schemas.openxmlformats.org/drawingml/2006/main">
+                  <a:graphicData uri="http://schemas.microsoft.com/office/word/2010/wordprocessingShape">
+                    <wps:wsp>
+                      <wps:cNvCnPr/>
+                      <wps:spPr>
+                        <a:xfrm flipV="1">
+                          <a:off x="0" y="0"/>
+                          <a:ext cx="2905125" cy="28575"/>
+                        </a:xfrm>
+                        <a:prstGeom prst="line">
+                          <a:avLst/>
+                        </a:prstGeom>
+                      </wps:spPr>
+                      <wps:style>
+                        <a:lnRef idx="1">
+                          <a:schemeClr val="dk1"/>
+                        </a:lnRef>
+                        <a:fillRef idx="0">
+                          <a:schemeClr val="dk1"/>
+                        </a:fillRef>
+                        <a:effectRef idx="0">
+                          <a:schemeClr val="dk1"/>
+                        </a:effectRef>
+                        <a:fontRef idx="minor">
+                          <a:schemeClr val="tx1"/>
+                        </a:fontRef>
+                      </wps:style>
+                      <wps:bodyPr/>
+                    </wps:wsp>
+                  </a:graphicData>
+                </a:graphic>
+                <wp14:sizeRelH relativeFrom="margin">
+                  <wp14:pctWidth>0</wp14:pctWidth>
+                </wp14:sizeRelH>
+                <wp14:sizeRelV relativeFrom="margin">
+                  <wp14:pctHeight>0</wp14:pctHeight>
+                </wp14:sizeRelV>
+              </wp:anchor>
+            </w:drawing>
+          </mc:Choice>
+          <mc:Fallback>
+            <w:pict>
+              <v:line w14:anchorId="65832FDD" id="Прямая соединительная линия 5" o:spid="_x0000_s1026" style="position:absolute;flip:y;z-index:251661312;visibility:visible;mso-wrap-style:square;mso-width-percent:0;mso-height-percent:0;mso-wrap-distance-left:9pt;mso-wrap-distance-top:0;mso-wrap-distance-right:9pt;mso-wrap-distance-bottom:0;mso-position-horizontal:absolute;mso-position-horizontal-relative:text;mso-position-vertical:absolute;mso-position-vertical-relative:text;mso-width-percent:0;mso-height-percent:0;mso-width-relative:margin;mso-height-relative:margin" from="210.45pt,214.85pt" to="439.2pt,217.1pt" o:gfxdata="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" strokecolor="black [3040]"/>
+            </w:pict>
+          </mc:Fallback>
+        </mc:AlternateContent>
+      </w:r>
+      <w:r>
+        <w:rPr>
+          <w:noProof/>
+        </w:rPr>
+        <mc:AlternateContent>
+          <mc:Choice Requires="wps">
+            <w:drawing>
+              <wp:anchor distT="0" distB="0" distL="114300" distR="114300" simplePos="0" relativeHeight="251662336" behindDoc="0" locked="0" layoutInCell="1" allowOverlap="1" wp14:anchorId="2091D36F" wp14:editId="15690B57">
+                <wp:simplePos x="0" y="0"/>
+                <wp:positionH relativeFrom="leftMargin">
+                  <wp:posOffset>6661785</wp:posOffset>
+                </wp:positionH>
+                <wp:positionV relativeFrom="paragraph">
+                  <wp:posOffset>2610485</wp:posOffset>
+                </wp:positionV>
+                <wp:extent cx="752475" cy="361950"/>
+                <wp:effectExtent l="0" t="0" r="0" b="0"/>
+                <wp:wrapNone/>
+                <wp:docPr id="7" name="Надпись 7"/>
+                <wp:cNvGraphicFramePr/>
+                <a:graphic xmlns:a="http://schemas.openxmlformats.org/drawingml/2006/main">
+                  <a:graphicData uri="http://schemas.microsoft.com/office/word/2010/wordprocessingShape">
+                    <wps:wsp>
+                      <wps:cNvSpPr txBox="1"/>
+                      <wps:spPr>
+                        <a:xfrm>
+                          <a:off x="0" y="0"/>
+                          <a:ext cx="752475" cy="361950"/>
+                        </a:xfrm>
+                        <a:prstGeom prst="rect">
+                          <a:avLst/>
+                        </a:prstGeom>
+                        <a:noFill/>
+                        <a:ln w="6350">
+                          <a:noFill/>
+                        </a:ln>
+                      </wps:spPr>
+                      <wps:txbx>
+                        <w:txbxContent>
+                          <w:p>
+                            <w:r>
+                              <w:t>Label5</w:t>
+                            </w:r>
+                          </w:p>
+                        </w:txbxContent>
+                      </wps:txbx>
+                      <wps:bodyPr rot="0" spcFirstLastPara="0" vertOverflow="overflow" horzOverflow="overflow" vert="horz" wrap="square" lIns="91440" tIns="45720" rIns="91440" bIns="45720" numCol="1" spcCol="0" rtlCol="0" fromWordArt="0" anchor="t" anchorCtr="0" forceAA="0" compatLnSpc="1">
+                        <a:prstTxWarp prst="textNoShape">
+                          <a:avLst/>
+                        </a:prstTxWarp>
+                        <a:noAutofit/>
+                      </wps:bodyPr>
+                    </wps:wsp>
+                  </a:graphicData>
+                </a:graphic>
+                <wp14:sizeRelH relativeFrom="margin">
+                  <wp14:pctWidth>0</wp14:pctWidth>
+                </wp14:sizeRelH>
+                <wp14:sizeRelV relativeFrom="margin">
+                  <wp14:pctHeight>0</wp14:pctHeight>
+                </wp14:sizeRelV>
+              </wp:anchor>
+            </w:drawing>
+          </mc:Choice>
+          <mc:Fallback>
+            <w:pict>
+              <v:shape w14:anchorId="2091D36F" id="Надпись 7" o:spid="_x0000_s1032" type="#_x0000_t202" style="position:absolute;left:0;text-align:left;margin-left:524.55pt;margin-top:205.55pt;width:59.25pt;height:28.5pt;z-index:251662336;visibility:visible;mso-wrap-style:square;mso-width-percent:0;mso-height-percent:0;mso-wrap-distance-left:9pt;mso-wrap-distance-top:0;mso-wrap-distance-right:9pt;mso-wrap-distance-bottom:0;mso-position-horizontal:absolute;mso-position-horizontal-relative:left-margin-area;mso-position-vertical:absolute;mso-position-vertical-relative:text;mso-width-percent:0;mso-height-percent:0;mso-width-relative:margin;mso-height-relative:margin;v-text-anchor:top" o:gfxdata="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" filled="f" stroked="f" strokeweight=".5pt">
+                <v:textbox>
+                  <w:txbxContent>
+                    <w:p>
+                      <w:r>
+                        <w:t>Label5</w:t>
+                      </w:r>
+                    </w:p>
+                  </w:txbxContent>
+                </v:textbox>
+                <w10:wrap anchorx="margin"/>
+              </v:shape>
+            </w:pict>
+          </mc:Fallback>
+        </mc:AlternateContent>
+      </w:r>
+      <w:r>
+        <w:rPr>
+          <w:noProof/>
+        </w:rPr>
+        <mc:AlternateContent>
+          <mc:Choice Requires="wps">
+            <w:drawing>
+              <wp:anchor distT="0" distB="0" distL="114300" distR="114300" simplePos="0" relativeHeight="251665408" behindDoc="0" locked="0" layoutInCell="1" allowOverlap="1" wp14:anchorId="79E4BD0D" wp14:editId="5735A19E">
+                <wp:simplePos x="0" y="0"/>
+                <wp:positionH relativeFrom="margin">
+                  <wp:align>left</wp:align>
+                </wp:positionH>
+                <wp:positionV relativeFrom="paragraph">
+                  <wp:posOffset>1842769</wp:posOffset>
+                </wp:positionV>
+                <wp:extent cx="2133600" cy="314325"/>
+                <wp:effectExtent l="0" t="0" r="19050" b="28575"/>
+                <wp:wrapNone/>
+                <wp:docPr id="18" name="Прямая соединительная линия 18"/>
+                <wp:cNvGraphicFramePr/>
+                <a:graphic xmlns:a="http://schemas.openxmlformats.org/drawingml/2006/main">
+                  <a:graphicData uri="http://schemas.microsoft.com/office/word/2010/wordprocessingShape">
+                    <wps:wsp>
+                      <wps:cNvCnPr/>
+                      <wps:spPr>
+                        <a:xfrm flipH="1" flipV="1">
+                          <a:off x="0" y="0"/>
+                          <a:ext cx="2133600" cy="314325"/>
+                        </a:xfrm>
+                        <a:prstGeom prst="line">
+                          <a:avLst/>
+                        </a:prstGeom>
+                      </wps:spPr>
+                      <wps:style>
+                        <a:lnRef idx="1">
+                          <a:schemeClr val="dk1"/>
+                        </a:lnRef>
+                        <a:fillRef idx="0">
+                          <a:schemeClr val="dk1"/>
+                        </a:fillRef>
+                        <a:effectRef idx="0">
+                          <a:schemeClr val="dk1"/>
+                        </a:effectRef>
+                        <a:fontRef idx="minor">
+                          <a:schemeClr val="tx1"/>
+                        </a:fontRef>
+                      </wps:style>
+                      <wps:bodyPr/>
+                    </wps:wsp>
+                  </a:graphicData>
+                </a:graphic>
+                <wp14:sizeRelH relativeFrom="margin">
+                  <wp14:pctWidth>0</wp14:pctWidth>
+                </wp14:sizeRelH>
+                <wp14:sizeRelV relativeFrom="margin">
+                  <wp14:pctHeight>0</wp14:pctHeight>
+                </wp14:sizeRelV>
+              </wp:anchor>
+            </w:drawing>
+          </mc:Choice>
+          <mc:Fallback>
+            <w:pict>
+              <v:line w14:anchorId="5F120CDF" id="Прямая соединительная линия 18" o:spid="_x0000_s1026" style="position:absolute;flip:x y;z-index:251665408;visibility:visible;mso-wrap-style:square;mso-width-percent:0;mso-height-percent:0;mso-wrap-distance-left:9pt;mso-wrap-distance-top:0;mso-wrap-distance-right:9pt;mso-wrap-distance-bottom:0;mso-position-horizontal:left;mso-position-horizontal-relative:margin;mso-position-vertical:absolute;mso-position-vertical-relative:text;mso-width-percent:0;mso-height-percent:0;mso-width-relative:margin;mso-height-relative:margin" from="0,145.1pt" to="168pt,169.85pt" o:gfxdata="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" strokecolor="black [3040]">
+                <w10:wrap anchorx="margin"/>
+              </v:line>
+            </w:pict>
+          </mc:Fallback>
+        </mc:AlternateContent>
+      </w:r>
+      <w:r>
+        <w:rPr>
+          <w:noProof/>
+        </w:rPr>
+        <mc:AlternateContent>
+          <mc:Choice Requires="wps">
+            <w:drawing>
+              <wp:anchor distT="0" distB="0" distL="114300" distR="114300" simplePos="0" relativeHeight="251666432" behindDoc="0" locked="0" layoutInCell="1" allowOverlap="1" wp14:anchorId="3F861B04" wp14:editId="16C74285">
+                <wp:simplePos x="0" y="0"/>
+                <wp:positionH relativeFrom="page">
+                  <wp:posOffset>381000</wp:posOffset>
+                </wp:positionH>
+                <wp:positionV relativeFrom="paragraph">
+                  <wp:posOffset>1690370</wp:posOffset>
+                </wp:positionV>
+                <wp:extent cx="752475" cy="361950"/>
+                <wp:effectExtent l="0" t="0" r="0" b="0"/>
+                <wp:wrapNone/>
+                <wp:docPr id="19" name="Надпись 19"/>
+                <wp:cNvGraphicFramePr/>
+                <a:graphic xmlns:a="http://schemas.openxmlformats.org/drawingml/2006/main">
+                  <a:graphicData uri="http://schemas.microsoft.com/office/word/2010/wordprocessingShape">
+                    <wps:wsp>
+                      <wps:cNvSpPr txBox="1"/>
+                      <wps:spPr>
+                        <a:xfrm>
+                          <a:off x="0" y="0"/>
+                          <a:ext cx="752475" cy="361950"/>
+                        </a:xfrm>
+                        <a:prstGeom prst="rect">
+                          <a:avLst/>
+                        </a:prstGeom>
+                        <a:noFill/>
+                        <a:ln w="6350">
+                          <a:noFill/>
+                        </a:ln>
+                      </wps:spPr>
+                      <wps:txbx>
+                        <w:txbxContent>
+                          <w:p>
+                            <w:r>
+                              <w:t>Button2</w:t>
+                            </w:r>
+                          </w:p>
+                        </w:txbxContent>
+                      </wps:txbx>
+                      <wps:bodyPr rot="0" spcFirstLastPara="0" vertOverflow="overflow" horzOverflow="overflow" vert="horz" wrap="square" lIns="91440" tIns="45720" rIns="91440" bIns="45720" numCol="1" spcCol="0" rtlCol="0" fromWordArt="0" anchor="t" anchorCtr="0" forceAA="0" compatLnSpc="1">
+                        <a:prstTxWarp prst="textNoShape">
+                          <a:avLst/>
+                        </a:prstTxWarp>
+                        <a:noAutofit/>
+                      </wps:bodyPr>
+                    </wps:wsp>
+                  </a:graphicData>
+                </a:graphic>
+                <wp14:sizeRelH relativeFrom="margin">
+                  <wp14:pctWidth>0</wp14:pctWidth>
+                </wp14:sizeRelH>
+                <wp14:sizeRelV relativeFrom="margin">
+                  <wp14:pctHeight>0</wp14:pctHeight>
+                </wp14:sizeRelV>
+              </wp:anchor>
+            </w:drawing>
+          </mc:Choice>
+          <mc:Fallback>
+            <w:pict>
+              <v:shape w14:anchorId="3F861B04" id="Надпись 19" o:spid="_x0000_s1033" type="#_x0000_t202" style="position:absolute;left:0;text-align:left;margin-left:30pt;margin-top:133.1pt;width:59.25pt;height:28.5pt;z-index:251666432;visibility:visible;mso-wrap-style:square;mso-width-percent:0;mso-height-percent:0;mso-wrap-distance-left:9pt;mso-wrap-distance-top:0;mso-wrap-distance-right:9pt;mso-wrap-distance-bottom:0;mso-position-horizontal:absolute;mso-position-horizontal-relative:page;mso-position-vertical:absolute;mso-position-vertical-relative:text;mso-width-percent:0;mso-height-percent:0;mso-width-relative:margin;mso-height-relative:margin;v-text-anchor:top" o:gfxdata="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" filled="f" stroked="f" strokeweight=".5pt">
+                <v:textbox>
+                  <w:txbxContent>
+                    <w:p>
+                      <w:r>
+                        <w:t>Button2</w:t>
+                      </w:r>
+                    </w:p>
+                  </w:txbxContent>
+                </v:textbox>
+                <w10:wrap anchorx="page"/>
+              </v:shape>
+            </w:pict>
+          </mc:Fallback>
+        </mc:AlternateContent>
+      </w:r>
+      <w:r>
+        <w:rPr>
+          <w:noProof/>
+        </w:rPr>
+        <mc:AlternateContent>
+          <mc:Choice Requires="wps">
+            <w:drawing>
+              <wp:anchor distT="0" distB="0" distL="114300" distR="114300" simplePos="0" relativeHeight="251670528" behindDoc="0" locked="0" layoutInCell="1" allowOverlap="1" wp14:anchorId="754FA887" wp14:editId="0C013670">
+                <wp:simplePos x="0" y="0"/>
+                <wp:positionH relativeFrom="column">
+                  <wp:posOffset>3777615</wp:posOffset>
+                </wp:positionH>
+                <wp:positionV relativeFrom="paragraph">
+                  <wp:posOffset>1652269</wp:posOffset>
+                </wp:positionV>
+                <wp:extent cx="1895475" cy="47625"/>
+                <wp:effectExtent l="0" t="0" r="28575" b="28575"/>
+                <wp:wrapNone/>
+                <wp:docPr id="16" name="Прямая соединительная линия 16"/>
+                <wp:cNvGraphicFramePr/>
+                <a:graphic xmlns:a="http://schemas.openxmlformats.org/drawingml/2006/main">
+                  <a:graphicData uri="http://schemas.microsoft.com/office/word/2010/wordprocessingShape">
+                    <wps:wsp>
+                      <wps:cNvCnPr/>
+                      <wps:spPr>
+                        <a:xfrm>
+                          <a:off x="0" y="0"/>
+                          <a:ext cx="1895475" cy="47625"/>
+                        </a:xfrm>
+                        <a:prstGeom prst="line">
+                          <a:avLst/>
+                        </a:prstGeom>
+                      </wps:spPr>
+                      <wps:style>
+                        <a:lnRef idx="1">
+                          <a:schemeClr val="dk1"/>
+                        </a:lnRef>
+                        <a:fillRef idx="0">
+                          <a:schemeClr val="dk1"/>
+                        </a:fillRef>
+                        <a:effectRef idx="0">
+                          <a:schemeClr val="dk1"/>
+                        </a:effectRef>
+                        <a:fontRef idx="minor">
+                          <a:schemeClr val="tx1"/>
+                        </a:fontRef>
+                      </wps:style>
+                      <wps:bodyPr/>
+                    </wps:wsp>
+                  </a:graphicData>
+                </a:graphic>
+                <wp14:sizeRelH relativeFrom="margin">
+                  <wp14:pctWidth>0</wp14:pctWidth>
+                </wp14:sizeRelH>
+                <wp14:sizeRelV relativeFrom="margin">
+                  <wp14:pctHeight>0</wp14:pctHeight>
+                </wp14:sizeRelV>
+              </wp:anchor>
+            </w:drawing>
+          </mc:Choice>
+          <mc:Fallback>
+            <w:pict>
+              <v:line w14:anchorId="089EAA0D" id="Прямая соединительная линия 16" o:spid="_x0000_s1026" style="position:absolute;z-index:251670528;visibility:visible;mso-wrap-style:square;mso-width-percent:0;mso-height-percent:0;mso-wrap-distance-left:9pt;mso-wrap-distance-top:0;mso-wrap-distance-right:9pt;mso-wrap-distance-bottom:0;mso-position-horizontal:absolute;mso-position-horizontal-relative:text;mso-position-vertical:absolute;mso-position-vertical-relative:text;mso-width-percent:0;mso-height-percent:0;mso-width-relative:margin;mso-height-relative:margin" from="297.45pt,130.1pt" to="446.7pt,133.85pt" o:gfxdata="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" strokecolor="black [3040]"/>
+            </w:pict>
+          </mc:Fallback>
+        </mc:AlternateContent>
+      </w:r>
+      <w:r>
+        <w:rPr>
+          <w:noProof/>
+        </w:rPr>
+        <mc:AlternateContent>
+          <mc:Choice Requires="wps">
+            <w:drawing>
+              <wp:anchor distT="0" distB="0" distL="114300" distR="114300" simplePos="0" relativeHeight="251663360" behindDoc="0" locked="0" layoutInCell="1" allowOverlap="1" wp14:anchorId="25920FAD" wp14:editId="6F702108">
+                <wp:simplePos x="0" y="0"/>
+                <wp:positionH relativeFrom="column">
+                  <wp:posOffset>-127635</wp:posOffset>
+                </wp:positionH>
+                <wp:positionV relativeFrom="paragraph">
+                  <wp:posOffset>1309370</wp:posOffset>
+                </wp:positionV>
+                <wp:extent cx="1504950" cy="304800"/>
+                <wp:effectExtent l="0" t="0" r="19050" b="19050"/>
+                <wp:wrapNone/>
+                <wp:docPr id="8" name="Прямая соединительная линия 8"/>
+                <wp:cNvGraphicFramePr/>
+                <a:graphic xmlns:a="http://schemas.openxmlformats.org/drawingml/2006/main">
+                  <a:graphicData uri="http://schemas.microsoft.com/office/word/2010/wordprocessingShape">
+                    <wps:wsp>
+                      <wps:cNvCnPr/>
+                      <wps:spPr>
+                        <a:xfrm>
+                          <a:off x="0" y="0"/>
+                          <a:ext cx="1504950" cy="304800"/>
+                        </a:xfrm>
+                        <a:prstGeom prst="line">
+                          <a:avLst/>
+                        </a:prstGeom>
+                      </wps:spPr>
+                      <wps:style>
+                        <a:lnRef idx="1">
+                          <a:schemeClr val="dk1"/>
+                        </a:lnRef>
+                        <a:fillRef idx="0">
+                          <a:schemeClr val="dk1"/>
+                        </a:fillRef>
+                        <a:effectRef idx="0">
+                          <a:schemeClr val="dk1"/>
+                        </a:effectRef>
+                        <a:fontRef idx="minor">
+                          <a:schemeClr val="tx1"/>
+                        </a:fontRef>
+                      </wps:style>
+                      <wps:bodyPr/>
+                    </wps:wsp>
+                  </a:graphicData>
+                </a:graphic>
+                <wp14:sizeRelH relativeFrom="margin">
+                  <wp14:pctWidth>0</wp14:pctWidth>
+                </wp14:sizeRelH>
+                <wp14:sizeRelV relativeFrom="margin">
+                  <wp14:pctHeight>0</wp14:pctHeight>
+                </wp14:sizeRelV>
+              </wp:anchor>
+            </w:drawing>
+          </mc:Choice>
+          <mc:Fallback>
+            <w:pict>
+              <v:line w14:anchorId="7058C859" id="Прямая соединительная линия 8" o:spid="_x0000_s1026" style="position:absolute;z-index:251663360;visibility:visible;mso-wrap-style:square;mso-width-percent:0;mso-height-percent:0;mso-wrap-distance-left:9pt;mso-wrap-distance-top:0;mso-wrap-distance-right:9pt;mso-wrap-distance-bottom:0;mso-position-horizontal:absolute;mso-position-horizontal-relative:text;mso-position-vertical:absolute;mso-position-vertical-relative:text;mso-width-percent:0;mso-height-percent:0;mso-width-relative:margin;mso-height-relative:margin" from="-10.05pt,103.1pt" to="108.45pt,127.1pt" o:gfxdata="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" strokecolor="black [3040]"/>
+            </w:pict>
+          </mc:Fallback>
+        </mc:AlternateContent>
+      </w:r>
+      <w:r>
+        <w:rPr>
+          <w:noProof/>
+        </w:rPr>
+        <mc:AlternateContent>
+          <mc:Choice Requires="wps">
+            <w:drawing>
+              <wp:anchor distT="0" distB="0" distL="114300" distR="114300" simplePos="0" relativeHeight="251664384" behindDoc="0" locked="0" layoutInCell="1" allowOverlap="1" wp14:anchorId="3BB03128" wp14:editId="715AB21B">
+                <wp:simplePos x="0" y="0"/>
+                <wp:positionH relativeFrom="leftMargin">
+                  <wp:posOffset>381000</wp:posOffset>
+                </wp:positionH>
+                <wp:positionV relativeFrom="paragraph">
+                  <wp:posOffset>1176020</wp:posOffset>
+                </wp:positionV>
+                <wp:extent cx="752475" cy="361950"/>
+                <wp:effectExtent l="0" t="0" r="0" b="0"/>
+                <wp:wrapNone/>
+                <wp:docPr id="9" name="Надпись 9"/>
+                <wp:cNvGraphicFramePr/>
+                <a:graphic xmlns:a="http://schemas.openxmlformats.org/drawingml/2006/main">
+                  <a:graphicData uri="http://schemas.microsoft.com/office/word/2010/wordprocessingShape">
+                    <wps:wsp>
+                      <wps:cNvSpPr txBox="1"/>
+                      <wps:spPr>
+                        <a:xfrm>
+                          <a:off x="0" y="0"/>
+                          <a:ext cx="752475" cy="361950"/>
+                        </a:xfrm>
+                        <a:prstGeom prst="rect">
+                          <a:avLst/>
+                        </a:prstGeom>
+                        <a:noFill/>
+                        <a:ln w="6350">
+                          <a:noFill/>
+                        </a:ln>
+                      </wps:spPr>
+                      <wps:txbx>
+                        <w:txbxContent>
+                          <w:p>
+                            <w:r>
+                              <w:t>Label6</w:t>
+                            </w:r>
+                          </w:p>
+                        </w:txbxContent>
+                      </wps:txbx>
+                      <wps:bodyPr rot="0" spcFirstLastPara="0" vertOverflow="overflow" horzOverflow="overflow" vert="horz" wrap="square" lIns="91440" tIns="45720" rIns="91440" bIns="45720" numCol="1" spcCol="0" rtlCol="0" fromWordArt="0" anchor="t" anchorCtr="0" forceAA="0" compatLnSpc="1">
+                        <a:prstTxWarp prst="textNoShape">
+                          <a:avLst/>
+                        </a:prstTxWarp>
+                        <a:noAutofit/>
+                      </wps:bodyPr>
+                    </wps:wsp>
+                  </a:graphicData>
+                </a:graphic>
+                <wp14:sizeRelH relativeFrom="margin">
+                  <wp14:pctWidth>0</wp14:pctWidth>
+                </wp14:sizeRelH>
+                <wp14:sizeRelV relativeFrom="margin">
+                  <wp14:pctHeight>0</wp14:pctHeight>
+                </wp14:sizeRelV>
+              </wp:anchor>
+            </w:drawing>
+          </mc:Choice>
+          <mc:Fallback>
+            <w:pict>
+              <v:shape w14:anchorId="3BB03128" id="Надпись 9" o:spid="_x0000_s1034" type="#_x0000_t202" style="position:absolute;left:0;text-align:left;margin-left:30pt;margin-top:92.6pt;width:59.25pt;height:28.5pt;z-index:251664384;visibility:visible;mso-wrap-style:square;mso-width-percent:0;mso-height-percent:0;mso-wrap-distance-left:9pt;mso-wrap-distance-top:0;mso-wrap-distance-right:9pt;mso-wrap-distance-bottom:0;mso-position-horizontal:absolute;mso-position-horizontal-relative:left-margin-area;mso-position-vertical:absolute;mso-position-vertical-relative:text;mso-width-percent:0;mso-height-percent:0;mso-width-relative:margin;mso-height-relative:margin;v-text-anchor:top" o:gfxdata="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" filled="f" stroked="f" strokeweight=".5pt">
+                <v:textbox>
+                  <w:txbxContent>
+                    <w:p>
+                      <w:r>
+                        <w:t>Label6</w:t>
+                      </w:r>
+                    </w:p>
+                  </w:txbxContent>
+                </v:textbox>
+                <w10:wrap anchorx="margin"/>
+              </v:shape>
+            </w:pict>
+          </mc:Fallback>
+        </mc:AlternateContent>
+      </w:r>
+      <w:r>
+        <w:rPr>
+          <w:noProof/>
+        </w:rPr>
+        <mc:AlternateContent>
+          <mc:Choice Requires="wps">
+            <w:drawing>
+              <wp:anchor distT="0" distB="0" distL="114300" distR="114300" simplePos="0" relativeHeight="251667456" behindDoc="0" locked="0" layoutInCell="1" allowOverlap="1" wp14:anchorId="3F6FA933" wp14:editId="39BAD8E1">
+                <wp:simplePos x="0" y="0"/>
+                <wp:positionH relativeFrom="margin">
+                  <wp:posOffset>-289560</wp:posOffset>
+                </wp:positionH>
+                <wp:positionV relativeFrom="paragraph">
+                  <wp:posOffset>385445</wp:posOffset>
+                </wp:positionV>
+                <wp:extent cx="419100" cy="0"/>
+                <wp:effectExtent l="0" t="0" r="0" b="0"/>
+                <wp:wrapNone/>
+                <wp:docPr id="10" name="Прямая соединительная линия 10"/>
+                <wp:cNvGraphicFramePr/>
+                <a:graphic xmlns:a="http://schemas.openxmlformats.org/drawingml/2006/main">
+                  <a:graphicData uri="http://schemas.microsoft.com/office/word/2010/wordprocessingShape">
+                    <wps:wsp>
+                      <wps:cNvCnPr/>
+                      <wps:spPr>
+                        <a:xfrm>
+                          <a:off x="0" y="0"/>
+                          <a:ext cx="419100" cy="0"/>
+                        </a:xfrm>
+                        <a:prstGeom prst="line">
+                          <a:avLst/>
+                        </a:prstGeom>
+                      </wps:spPr>
+                      <wps:style>
+                        <a:lnRef idx="1">
+                          <a:schemeClr val="dk1"/>
+                        </a:lnRef>
+                        <a:fillRef idx="0">
+                          <a:schemeClr val="dk1"/>
+                        </a:fillRef>
+                        <a:effectRef idx="0">
+                          <a:schemeClr val="dk1"/>
+                        </a:effectRef>
+                        <a:fontRef idx="minor">
+                          <a:schemeClr val="tx1"/>
+                        </a:fontRef>
+                      </wps:style>
+                      <wps:bodyPr/>
+                    </wps:wsp>
+                  </a:graphicData>
+                </a:graphic>
+                <wp14:sizeRelH relativeFrom="margin">
+                  <wp14:pctWidth>0</wp14:pctWidth>
+                </wp14:sizeRelH>
+                <wp14:sizeRelV relativeFrom="margin">
+                  <wp14:pctHeight>0</wp14:pctHeight>
+                </wp14:sizeRelV>
+              </wp:anchor>
+            </w:drawing>
+          </mc:Choice>
+          <mc:Fallback>
+            <w:pict>
+              <v:line w14:anchorId="47E13536" id="Прямая соединительная линия 10" o:spid="_x0000_s1026" style="position:absolute;z-index:251667456;visibility:visible;mso-wrap-style:square;mso-width-percent:0;mso-height-percent:0;mso-wrap-distance-left:9pt;mso-wrap-distance-top:0;mso-wrap-distance-right:9pt;mso-wrap-distance-bottom:0;mso-position-horizontal:absolute;mso-position-horizontal-relative:margin;mso-position-vertical:absolute;mso-position-vertical-relative:text;mso-width-percent:0;mso-height-percent:0;mso-width-relative:margin;mso-height-relative:margin" from="-22.8pt,30.35pt" to="10.2pt,30.35pt" o:gfxdata="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" strokecolor="black [3040]">
+                <w10:wrap anchorx="margin"/>
+              </v:line>
+            </w:pict>
+          </mc:Fallback>
+        </mc:AlternateContent>
+      </w:r>
+      <w:r>
+        <w:rPr>
+          <w:noProof/>
+        </w:rPr>
+        <mc:AlternateContent>
+          <mc:Choice Requires="wps">
+            <w:drawing>
+              <wp:anchor distT="0" distB="0" distL="114300" distR="114300" simplePos="0" relativeHeight="251678720" behindDoc="0" locked="0" layoutInCell="1" allowOverlap="1" wp14:anchorId="501EF0ED" wp14:editId="4E0D8EFC">
+                <wp:simplePos x="0" y="0"/>
+                <wp:positionH relativeFrom="margin">
+                  <wp:posOffset>-289560</wp:posOffset>
+                </wp:positionH>
+                <wp:positionV relativeFrom="paragraph">
+                  <wp:posOffset>652144</wp:posOffset>
+                </wp:positionV>
+                <wp:extent cx="447675" cy="257175"/>
+                <wp:effectExtent l="0" t="0" r="28575" b="28575"/>
+                <wp:wrapNone/>
+                <wp:docPr id="3" name="Прямая соединительная линия 3"/>
+                <wp:cNvGraphicFramePr/>
+                <a:graphic xmlns:a="http://schemas.openxmlformats.org/drawingml/2006/main">
+                  <a:graphicData uri="http://schemas.microsoft.com/office/word/2010/wordprocessingShape">
+                    <wps:wsp>
+                      <wps:cNvCnPr/>
+                      <wps:spPr>
+                        <a:xfrm flipH="1">
+                          <a:off x="0" y="0"/>
+                          <a:ext cx="447675" cy="257175"/>
+                        </a:xfrm>
+                        <a:prstGeom prst="line">
+                          <a:avLst/>
+                        </a:prstGeom>
+                      </wps:spPr>
+                      <wps:style>
+                        <a:lnRef idx="1">
+                          <a:schemeClr val="dk1"/>
+                        </a:lnRef>
+                        <a:fillRef idx="0">
+                          <a:schemeClr val="dk1"/>
+                        </a:fillRef>
+                        <a:effectRef idx="0">
+                          <a:schemeClr val="dk1"/>
+                        </a:effectRef>
+                        <a:fontRef idx="minor">
+                          <a:schemeClr val="tx1"/>
+                        </a:fontRef>
+                      </wps:style>
+                      <wps:bodyPr/>
+                    </wps:wsp>
+                  </a:graphicData>
+                </a:graphic>
+                <wp14:sizeRelH relativeFrom="margin">
+                  <wp14:pctWidth>0</wp14:pctWidth>
+                </wp14:sizeRelH>
+                <wp14:sizeRelV relativeFrom="margin">
+                  <wp14:pctHeight>0</wp14:pctHeight>
+                </wp14:sizeRelV>
+              </wp:anchor>
+            </w:drawing>
+          </mc:Choice>
+          <mc:Fallback>
+            <w:pict>
+              <v:line w14:anchorId="793B70AE" id="Прямая соединительная линия 3" o:spid="_x0000_s1026" style="position:absolute;flip:x;z-index:251678720;visibility:visible;mso-wrap-style:square;mso-width-percent:0;mso-height-percent:0;mso-wrap-distance-left:9pt;mso-wrap-distance-top:0;mso-wrap-distance-right:9pt;mso-wrap-distance-bottom:0;mso-position-horizontal:absolute;mso-position-horizontal-relative:margin;mso-position-vertical:absolute;mso-position-vertical-relative:text;mso-width-percent:0;mso-height-percent:0;mso-width-relative:margin;mso-height-relative:margin" from="-22.8pt,51.35pt" to="12.45pt,71.6pt" o:gfxdata="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" strokecolor="black [3040]">
+                <w10:wrap anchorx="margin"/>
+              </v:line>
+            </w:pict>
+          </mc:Fallback>
+        </mc:AlternateContent>
+      </w:r>
+      <w:r>
+        <w:rPr>
+          <w:noProof/>
+        </w:rPr>
+        <mc:AlternateContent>
+          <mc:Choice Requires="wps">
+            <w:drawing>
+              <wp:anchor distT="0" distB="0" distL="114300" distR="114300" simplePos="0" relativeHeight="251675648" behindDoc="0" locked="0" layoutInCell="1" allowOverlap="1" wp14:anchorId="7933400C" wp14:editId="3E2CF8C8">
+                <wp:simplePos x="0" y="0"/>
+                <wp:positionH relativeFrom="leftMargin">
+                  <wp:posOffset>114300</wp:posOffset>
+                </wp:positionH>
+                <wp:positionV relativeFrom="paragraph">
+                  <wp:posOffset>614045</wp:posOffset>
+                </wp:positionV>
+                <wp:extent cx="838200" cy="542925"/>
+                <wp:effectExtent l="0" t="0" r="0" b="0"/>
+                <wp:wrapNone/>
+                <wp:docPr id="26" name="Надпись 26"/>
+                <wp:cNvGraphicFramePr/>
+                <a:graphic xmlns:a="http://schemas.openxmlformats.org/drawingml/2006/main">
+                  <a:graphicData uri="http://schemas.microsoft.com/office/word/2010/wordprocessingShape">
+                    <wps:wsp>
+                      <wps:cNvSpPr txBox="1"/>
+                      <wps:spPr>
+                        <a:xfrm>
+                          <a:off x="0" y="0"/>
+                          <a:ext cx="838200" cy="542925"/>
+                        </a:xfrm>
+                        <a:prstGeom prst="rect">
+                          <a:avLst/>
+                        </a:prstGeom>
+                        <a:noFill/>
+                        <a:ln w="6350">
+                          <a:noFill/>
+                        </a:ln>
+                      </wps:spPr>
+                      <wps:txbx>
+                        <w:txbxContent>
+                          <w:p>
+                            <w:r>
+                              <w:rPr>
+                                <w:sz w:val="26"/>
+                                <w:szCs w:val="26"/>
+                              </w:rPr>
+                              <w:t>toolStripButton1</w:t>
+                            </w:r>
+                          </w:p>
+                        </w:txbxContent>
+                      </wps:txbx>
+                      <wps:bodyPr rot="0" spcFirstLastPara="0" vertOverflow="overflow" horzOverflow="overflow" vert="horz" wrap="square" lIns="91440" tIns="45720" rIns="91440" bIns="45720" numCol="1" spcCol="0" rtlCol="0" fromWordArt="0" anchor="t" anchorCtr="0" forceAA="0" compatLnSpc="1">
+                        <a:prstTxWarp prst="textNoShape">
+                          <a:avLst/>
+                        </a:prstTxWarp>
+                        <a:noAutofit/>
+                      </wps:bodyPr>
+                    </wps:wsp>
+                  </a:graphicData>
+                </a:graphic>
+                <wp14:sizeRelH relativeFrom="margin">
+                  <wp14:pctWidth>0</wp14:pctWidth>
+                </wp14:sizeRelH>
+                <wp14:sizeRelV relativeFrom="margin">
+                  <wp14:pctHeight>0</wp14:pctHeight>
+                </wp14:sizeRelV>
+              </wp:anchor>
+            </w:drawing>
+          </mc:Choice>
+          <mc:Fallback>
+            <w:pict>
+              <v:shape w14:anchorId="7933400C" id="Надпись 26" o:spid="_x0000_s1035" type="#_x0000_t202" style="position:absolute;left:0;text-align:left;margin-left:9pt;margin-top:48.35pt;width:66pt;height:42.75pt;z-index:251675648;visibility:visible;mso-wrap-style:square;mso-width-percent:0;mso-height-percent:0;mso-wrap-distance-left:9pt;mso-wrap-distance-top:0;mso-wrap-distance-right:9pt;mso-wrap-distance-bottom:0;mso-position-horizontal:absolute;mso-position-horizontal-relative:left-margin-area;mso-position-vertical:absolute;mso-position-vertical-relative:text;mso-width-percent:0;mso-height-percent:0;mso-width-relative:margin;mso-height-relative:margin;v-text-anchor:top" o:gfxdata="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" filled="f" stroked="f" strokeweight=".5pt">
+                <v:textbox>
+                  <w:txbxContent>
+                    <w:p>
+                      <w:r>
+                        <w:rPr>
+                          <w:sz w:val="26"/>
+                          <w:szCs w:val="26"/>
+                        </w:rPr>
+                        <w:t>toolStripButton1</w:t>
+                      </w:r>
+                    </w:p>
+                  </w:txbxContent>
+                </v:textbox>
+                <w10:wrap anchorx="margin"/>
+              </v:shape>
+            </w:pict>
+          </mc:Fallback>
+        </mc:AlternateContent>
+      </w:r>
+      <w:r>
+        <w:rPr>
+          <w:noProof/>
+        </w:rPr>
+        <mc:AlternateContent>
+          <mc:Choice Requires="wps">
+            <w:drawing>
+              <wp:anchor distT="0" distB="0" distL="114300" distR="114300" simplePos="0" relativeHeight="251671552" behindDoc="0" locked="0" layoutInCell="1" allowOverlap="1" wp14:anchorId="5E50E433" wp14:editId="604F66AC">
+                <wp:simplePos x="0" y="0"/>
+                <wp:positionH relativeFrom="leftMargin">
+                  <wp:posOffset>6718935</wp:posOffset>
+                </wp:positionH>
+                <wp:positionV relativeFrom="paragraph">
+                  <wp:posOffset>1590675</wp:posOffset>
+                </wp:positionV>
+                <wp:extent cx="752475" cy="361950"/>
+                <wp:effectExtent l="0" t="0" r="0" b="0"/>
+                <wp:wrapNone/>
+                <wp:docPr id="17" name="Надпись 17"/>
+                <wp:cNvGraphicFramePr/>
+                <a:graphic xmlns:a="http://schemas.openxmlformats.org/drawingml/2006/main">
+                  <a:graphicData uri="http://schemas.microsoft.com/office/word/2010/wordprocessingShape">
+                    <wps:wsp>
+                      <wps:cNvSpPr txBox="1"/>
+                      <wps:spPr>
+                        <a:xfrm>
+                          <a:off x="0" y="0"/>
+                          <a:ext cx="752475" cy="361950"/>
+                        </a:xfrm>
+                        <a:prstGeom prst="rect">
+                          <a:avLst/>
+                        </a:prstGeom>
+                        <a:noFill/>
+                        <a:ln w="6350">
+                          <a:noFill/>
+                        </a:ln>
+                      </wps:spPr>
+                      <wps:txbx>
+                        <w:txbxContent>
+                          <w:p>
+                            <w:r>
+                              <w:t>textBox1</w:t>
+                            </w:r>
+                          </w:p>
+                        </w:txbxContent>
+                      </wps:txbx>
+                      <wps:bodyPr rot="0" spcFirstLastPara="0" vertOverflow="overflow" horzOverflow="overflow" vert="horz" wrap="square" lIns="91440" tIns="45720" rIns="91440" bIns="45720" numCol="1" spcCol="0" rtlCol="0" fromWordArt="0" anchor="t" anchorCtr="0" forceAA="0" compatLnSpc="1">
+                        <a:prstTxWarp prst="textNoShape">
+                          <a:avLst/>
+                        </a:prstTxWarp>
+                        <a:noAutofit/>
+                      </wps:bodyPr>
+                    </wps:wsp>
+                  </a:graphicData>
+                </a:graphic>
+                <wp14:sizeRelH relativeFrom="margin">
+                  <wp14:pctWidth>0</wp14:pctWidth>
+                </wp14:sizeRelH>
+                <wp14:sizeRelV relativeFrom="margin">
+                  <wp14:pctHeight>0</wp14:pctHeight>
+                </wp14:sizeRelV>
+              </wp:anchor>
+            </w:drawing>
+          </mc:Choice>
+          <mc:Fallback>
+            <w:pict>
+              <v:shape w14:anchorId="5E50E433" id="Надпись 17" o:spid="_x0000_s1036" type="#_x0000_t202" style="position:absolute;left:0;text-align:left;margin-left:529.05pt;margin-top:125.25pt;width:59.25pt;height:28.5pt;z-index:251671552;visibility:visible;mso-wrap-style:square;mso-width-percent:0;mso-height-percent:0;mso-wrap-distance-left:9pt;mso-wrap-distance-top:0;mso-wrap-distance-right:9pt;mso-wrap-distance-bottom:0;mso-position-horizontal:absolute;mso-position-horizontal-relative:left-margin-area;mso-position-vertical:absolute;mso-position-vertical-relative:text;mso-width-percent:0;mso-height-percent:0;mso-width-relative:margin;mso-height-relative:margin;v-text-anchor:top" o:gfxdata="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" filled="f" stroked="f" strokeweight=".5pt">
+                <v:textbox>
+                  <w:txbxContent>
+                    <w:p>
+                      <w:r>
+                        <w:t>textBox1</w:t>
+                      </w:r>
+                    </w:p>
+                  </w:txbxContent>
+                </v:textbox>
+                <w10:wrap anchorx="margin"/>
+              </v:shape>
+            </w:pict>
+          </mc:Fallback>
+        </mc:AlternateContent>
+      </w:r>
+      <w:r>
+        <w:rPr>
+          <w:noProof/>
+        </w:rPr>
+        <w:drawing>
+          <wp:inline distT="0" distB="0" distL="0" distR="0" wp14:anchorId="6122AEC5" wp14:editId="0A97B70D">
+            <wp:extent cx="5830114" cy="3381847"/>
+            <wp:effectExtent l="0" t="0" r="0" b="9525"/>
+            <wp:docPr id="1" name="Рисунок 1"/>
+            <wp:cNvGraphicFramePr>
+              <a:graphicFrameLocks xmlns:a="http://schemas.openxmlformats.org/drawingml/2006/main" noChangeAspect="1"/>
+            </wp:cNvGraphicFramePr>
+            <a:graphic xmlns:a="http://schemas.openxmlformats.org/drawingml/2006/main">
+              <a:graphicData uri="http://schemas.openxmlformats.org/drawingml/2006/picture">
+                <pic:pic xmlns:pic="http://schemas.openxmlformats.org/drawingml/2006/picture">
+                  <pic:nvPicPr>
+                    <pic:cNvPr id="1" name=""/>
+                    <pic:cNvPicPr/>
+                  </pic:nvPicPr>
+                  <pic:blipFill>
+                    <a:blip r:embed="rId6"/>
+                    <a:stretch>
+                      <a:fillRect/>
+                    </a:stretch>
+                  </pic:blipFill>
+                  <pic:spPr>
+                    <a:xfrm>
+                      <a:off x="0" y="0"/>
+                      <a:ext cx="5830114" cy="3381847"/>
+                    </a:xfrm>
+                    <a:prstGeom prst="rect">
+                      <a:avLst/>
+                    </a:prstGeom>
+                  </pic:spPr>
+                </pic:pic>
+              </a:graphicData>
+            </a:graphic>
+          </wp:inline>
+        </w:drawing>
+      </w:r>
+    </w:p>
+    <w:p>
+      <w:pPr>
+        <w:pStyle w:val="Heading1"/>
+        <w:rPr>
+          <w:rFonts w:ascii="Times New Roman" w:hAnsi="Times New Roman" w:cs="Times New Roman"/>
+          <w:color w:val="000000" w:themeColor="text1"/>
           <w:lang w:val="ru-RU"/>
         </w:rPr>
       </w:pPr>
@@ -1418,7 +3243,6 @@
           <w:sz w:val="28"/>
           <w:szCs w:val="24"/>
         </w:rPr>
-        <w:lastRenderedPageBreak/>
         <w:t>toolStripButton</w:t>
       </w:r>
       <w:proofErr w:type="spellEnd"/>
@@ -1456,6 +3280,7 @@
           <w:sz w:val="28"/>
           <w:szCs w:val="24"/>
         </w:rPr>
+        <w:lastRenderedPageBreak/>
         <w:t>TextBox</w:t>
       </w:r>
       <w:proofErr w:type="spellEnd"/>
@@ -2177,7 +4002,6 @@
           </w:tcPr>
           <w:p>
             <w:r>
-              <w:lastRenderedPageBreak/>
               <w:t>Обработка ошибки - пустое поле</w:t>
             </w:r>
           </w:p>
@@ -2230,7 +4054,14 @@
               <w:rPr>
                 <w:lang w:val="ru-RU"/>
               </w:rPr>
-              <w:t>Диалог ошибки: "Введите корректное числовое значение"</w:t>
+              <w:t xml:space="preserve">Диалог ошибки: "Введите корректное </w:t>
+            </w:r>
+            <w:r>
+              <w:rPr>
+                <w:lang w:val="ru-RU"/>
+              </w:rPr>
+              <w:lastRenderedPageBreak/>
+              <w:t>числовое значение"</w:t>
             </w:r>
           </w:p>
         </w:tc>
@@ -2245,6 +4076,7 @@
             </w:pPr>
             <w:proofErr w:type="spellStart"/>
             <w:r>
+              <w:lastRenderedPageBreak/>
               <w:t>Соответствует</w:t>
             </w:r>
             <w:proofErr w:type="spellEnd"/>
@@ -2700,6 +4532,9 @@
         <w:br w:type="page"/>
       </w:r>
       <w:r>
+        <w:rPr>
+          <w:noProof/>
+        </w:rPr>
         <w:lastRenderedPageBreak/>
         <w:drawing>
           <wp:inline distT="0" distB="0" distL="0" distR="0" wp14:anchorId="59A2F4F9" wp14:editId="0B387761">
@@ -2717,7 +4552,7 @@
                     <pic:cNvPicPr/>
                   </pic:nvPicPr>
                   <pic:blipFill>
-                    <a:blip r:embed="rId6"/>
+                    <a:blip r:embed="rId7"/>
                     <a:stretch>
                       <a:fillRect/>
                     </a:stretch>
@@ -2896,6 +4731,7 @@
       </w:pPr>
       <w:r>
         <w:rPr>
+          <w:noProof/>
           <w:lang w:val="ru-RU"/>
         </w:rPr>
         <w:drawing>
@@ -2914,7 +4750,7 @@
                     <pic:cNvPicPr/>
                   </pic:nvPicPr>
                   <pic:blipFill>
-                    <a:blip r:embed="rId7"/>
+                    <a:blip r:embed="rId8"/>
                     <a:stretch>
                       <a:fillRect/>
                     </a:stretch>
@@ -3044,6 +4880,7 @@
       </w:pPr>
       <w:r>
         <w:rPr>
+          <w:noProof/>
           <w:lang w:val="ru-RU"/>
         </w:rPr>
         <w:lastRenderedPageBreak/>
@@ -3063,7 +4900,7 @@
                     <pic:cNvPicPr/>
                   </pic:nvPicPr>
                   <pic:blipFill>
-                    <a:blip r:embed="rId8"/>
+                    <a:blip r:embed="rId9"/>
                     <a:stretch>
                       <a:fillRect/>
                     </a:stretch>
@@ -3201,6 +5038,7 @@
       </w:pPr>
       <w:r>
         <w:rPr>
+          <w:noProof/>
           <w:lang w:val="ru-RU"/>
         </w:rPr>
         <w:drawing>
@@ -3219,7 +5057,7 @@
                     <pic:cNvPicPr/>
                   </pic:nvPicPr>
                   <pic:blipFill>
-                    <a:blip r:embed="rId9"/>
+                    <a:blip r:embed="rId10"/>
                     <a:stretch>
                       <a:fillRect/>
                     </a:stretch>
@@ -3357,6 +5195,7 @@
       </w:pPr>
       <w:r>
         <w:rPr>
+          <w:noProof/>
           <w:lang w:val="ru-RU"/>
         </w:rPr>
         <w:lastRenderedPageBreak/>
@@ -3376,7 +5215,7 @@
                     <pic:cNvPicPr/>
                   </pic:nvPicPr>
                   <pic:blipFill>
-                    <a:blip r:embed="rId10"/>
+                    <a:blip r:embed="rId11"/>
                     <a:stretch>
                       <a:fillRect/>
                     </a:stretch>
@@ -3514,6 +5353,7 @@
       </w:pPr>
       <w:r>
         <w:rPr>
+          <w:noProof/>
           <w:lang w:val="ru-RU"/>
         </w:rPr>
         <w:drawing>
@@ -3532,7 +5372,7 @@
                     <pic:cNvPicPr/>
                   </pic:nvPicPr>
                   <pic:blipFill>
-                    <a:blip r:embed="rId11"/>
+                    <a:blip r:embed="rId12"/>
                     <a:stretch>
                       <a:fillRect/>
                     </a:stretch>
@@ -3670,6 +5510,7 @@
       </w:pPr>
       <w:r>
         <w:rPr>
+          <w:noProof/>
           <w:lang w:val="ru-RU"/>
         </w:rPr>
         <w:lastRenderedPageBreak/>
@@ -3689,7 +5530,7 @@
                     <pic:cNvPicPr/>
                   </pic:nvPicPr>
                   <pic:blipFill>
-                    <a:blip r:embed="rId12"/>
+                    <a:blip r:embed="rId13"/>
                     <a:stretch>
                       <a:fillRect/>
                     </a:stretch>
@@ -3827,6 +5668,7 @@
       </w:pPr>
       <w:r>
         <w:rPr>
+          <w:noProof/>
           <w:lang w:val="ru-RU"/>
         </w:rPr>
         <w:drawing>
@@ -3845,7 +5687,7 @@
                     <pic:cNvPicPr/>
                   </pic:nvPicPr>
                   <pic:blipFill>
-                    <a:blip r:embed="rId13"/>
+                    <a:blip r:embed="rId14"/>
                     <a:stretch>
                       <a:fillRect/>
                     </a:stretch>
@@ -3983,6 +5825,7 @@
       </w:pPr>
       <w:r>
         <w:rPr>
+          <w:noProof/>
           <w:lang w:val="ru-RU"/>
         </w:rPr>
         <w:lastRenderedPageBreak/>
@@ -4002,7 +5845,7 @@
                     <pic:cNvPicPr/>
                   </pic:nvPicPr>
                   <pic:blipFill>
-                    <a:blip r:embed="rId14"/>
+                    <a:blip r:embed="rId15"/>
                     <a:stretch>
                       <a:fillRect/>
                     </a:stretch>
@@ -4140,6 +5983,7 @@
       </w:pPr>
       <w:r>
         <w:rPr>
+          <w:noProof/>
           <w:lang w:val="ru-RU"/>
         </w:rPr>
         <w:drawing>
@@ -4158,7 +6002,7 @@
                     <pic:cNvPicPr/>
                   </pic:nvPicPr>
                   <pic:blipFill>
-                    <a:blip r:embed="rId15"/>
+                    <a:blip r:embed="rId16"/>
                     <a:stretch>
                       <a:fillRect/>
                     </a:stretch>
@@ -4358,44 +6202,293 @@
           <w:rFonts w:ascii="Courier New" w:hAnsi="Courier New"/>
           <w:sz w:val="18"/>
         </w:rPr>
-        <w:t>using System;</w:t>
-      </w:r>
-      <w:r>
-        <w:rPr>
-          <w:rFonts w:ascii="Courier New" w:hAnsi="Courier New"/>
-          <w:sz w:val="18"/>
+        <w:t>using</w:t>
+      </w:r>
+      <w:r>
+        <w:rPr>
+          <w:rFonts w:ascii="Courier New" w:hAnsi="Courier New"/>
+          <w:sz w:val="18"/>
+          <w:lang w:val="ru-RU"/>
+        </w:rPr>
+        <w:t xml:space="preserve"> </w:t>
+      </w:r>
+      <w:r>
+        <w:rPr>
+          <w:rFonts w:ascii="Courier New" w:hAnsi="Courier New"/>
+          <w:sz w:val="18"/>
+        </w:rPr>
+        <w:t>System</w:t>
+      </w:r>
+      <w:r>
+        <w:rPr>
+          <w:rFonts w:ascii="Courier New" w:hAnsi="Courier New"/>
+          <w:sz w:val="18"/>
+          <w:lang w:val="ru-RU"/>
+        </w:rPr>
+        <w:t>;</w:t>
+      </w:r>
+      <w:r>
+        <w:rPr>
+          <w:rFonts w:ascii="Courier New" w:hAnsi="Courier New"/>
+          <w:sz w:val="18"/>
+          <w:lang w:val="ru-RU"/>
         </w:rPr>
         <w:br/>
-        <w:t>using System.Collections.Generic;</w:t>
-      </w:r>
-      <w:r>
-        <w:rPr>
-          <w:rFonts w:ascii="Courier New" w:hAnsi="Courier New"/>
-          <w:sz w:val="18"/>
+      </w:r>
+      <w:r>
+        <w:rPr>
+          <w:rFonts w:ascii="Courier New" w:hAnsi="Courier New"/>
+          <w:sz w:val="18"/>
+        </w:rPr>
+        <w:t>using</w:t>
+      </w:r>
+      <w:r>
+        <w:rPr>
+          <w:rFonts w:ascii="Courier New" w:hAnsi="Courier New"/>
+          <w:sz w:val="18"/>
+          <w:lang w:val="ru-RU"/>
+        </w:rPr>
+        <w:t xml:space="preserve"> </w:t>
+      </w:r>
+      <w:r>
+        <w:rPr>
+          <w:rFonts w:ascii="Courier New" w:hAnsi="Courier New"/>
+          <w:sz w:val="18"/>
+        </w:rPr>
+        <w:t>System</w:t>
+      </w:r>
+      <w:r>
+        <w:rPr>
+          <w:rFonts w:ascii="Courier New" w:hAnsi="Courier New"/>
+          <w:sz w:val="18"/>
+          <w:lang w:val="ru-RU"/>
+        </w:rPr>
+        <w:t>.</w:t>
+      </w:r>
+      <w:r>
+        <w:rPr>
+          <w:rFonts w:ascii="Courier New" w:hAnsi="Courier New"/>
+          <w:sz w:val="18"/>
+        </w:rPr>
+        <w:t>Collections</w:t>
+      </w:r>
+      <w:r>
+        <w:rPr>
+          <w:rFonts w:ascii="Courier New" w:hAnsi="Courier New"/>
+          <w:sz w:val="18"/>
+          <w:lang w:val="ru-RU"/>
+        </w:rPr>
+        <w:t>.</w:t>
+      </w:r>
+      <w:r>
+        <w:rPr>
+          <w:rFonts w:ascii="Courier New" w:hAnsi="Courier New"/>
+          <w:sz w:val="18"/>
+        </w:rPr>
+        <w:t>Generic</w:t>
+      </w:r>
+      <w:r>
+        <w:rPr>
+          <w:rFonts w:ascii="Courier New" w:hAnsi="Courier New"/>
+          <w:sz w:val="18"/>
+          <w:lang w:val="ru-RU"/>
+        </w:rPr>
+        <w:t>;</w:t>
+      </w:r>
+      <w:r>
+        <w:rPr>
+          <w:rFonts w:ascii="Courier New" w:hAnsi="Courier New"/>
+          <w:sz w:val="18"/>
+          <w:lang w:val="ru-RU"/>
         </w:rPr>
         <w:br/>
-        <w:t>using System.Linq;</w:t>
-      </w:r>
-      <w:r>
-        <w:rPr>
-          <w:rFonts w:ascii="Courier New" w:hAnsi="Courier New"/>
-          <w:sz w:val="18"/>
+      </w:r>
+      <w:r>
+        <w:rPr>
+          <w:rFonts w:ascii="Courier New" w:hAnsi="Courier New"/>
+          <w:sz w:val="18"/>
+        </w:rPr>
+        <w:t>using</w:t>
+      </w:r>
+      <w:r>
+        <w:rPr>
+          <w:rFonts w:ascii="Courier New" w:hAnsi="Courier New"/>
+          <w:sz w:val="18"/>
+          <w:lang w:val="ru-RU"/>
+        </w:rPr>
+        <w:t xml:space="preserve"> </w:t>
+      </w:r>
+      <w:r>
+        <w:rPr>
+          <w:rFonts w:ascii="Courier New" w:hAnsi="Courier New"/>
+          <w:sz w:val="18"/>
+        </w:rPr>
+        <w:t>System</w:t>
+      </w:r>
+      <w:r>
+        <w:rPr>
+          <w:rFonts w:ascii="Courier New" w:hAnsi="Courier New"/>
+          <w:sz w:val="18"/>
+          <w:lang w:val="ru-RU"/>
+        </w:rPr>
+        <w:t>.</w:t>
+      </w:r>
+      <w:r>
+        <w:rPr>
+          <w:rFonts w:ascii="Courier New" w:hAnsi="Courier New"/>
+          <w:sz w:val="18"/>
+        </w:rPr>
+        <w:t>Linq</w:t>
+      </w:r>
+      <w:r>
+        <w:rPr>
+          <w:rFonts w:ascii="Courier New" w:hAnsi="Courier New"/>
+          <w:sz w:val="18"/>
+          <w:lang w:val="ru-RU"/>
+        </w:rPr>
+        <w:t>;</w:t>
+      </w:r>
+      <w:r>
+        <w:rPr>
+          <w:rFonts w:ascii="Courier New" w:hAnsi="Courier New"/>
+          <w:sz w:val="18"/>
+          <w:lang w:val="ru-RU"/>
         </w:rPr>
         <w:br/>
-        <w:t>using System.Threading.Tasks;</w:t>
-      </w:r>
-      <w:r>
-        <w:rPr>
-          <w:rFonts w:ascii="Courier New" w:hAnsi="Courier New"/>
-          <w:sz w:val="18"/>
+      </w:r>
+      <w:r>
+        <w:rPr>
+          <w:rFonts w:ascii="Courier New" w:hAnsi="Courier New"/>
+          <w:sz w:val="18"/>
+        </w:rPr>
+        <w:t>using</w:t>
+      </w:r>
+      <w:r>
+        <w:rPr>
+          <w:rFonts w:ascii="Courier New" w:hAnsi="Courier New"/>
+          <w:sz w:val="18"/>
+          <w:lang w:val="ru-RU"/>
+        </w:rPr>
+        <w:t xml:space="preserve"> </w:t>
+      </w:r>
+      <w:r>
+        <w:rPr>
+          <w:rFonts w:ascii="Courier New" w:hAnsi="Courier New"/>
+          <w:sz w:val="18"/>
+        </w:rPr>
+        <w:t>System</w:t>
+      </w:r>
+      <w:r>
+        <w:rPr>
+          <w:rFonts w:ascii="Courier New" w:hAnsi="Courier New"/>
+          <w:sz w:val="18"/>
+          <w:lang w:val="ru-RU"/>
+        </w:rPr>
+        <w:t>.</w:t>
+      </w:r>
+      <w:r>
+        <w:rPr>
+          <w:rFonts w:ascii="Courier New" w:hAnsi="Courier New"/>
+          <w:sz w:val="18"/>
+        </w:rPr>
+        <w:t>Threading</w:t>
+      </w:r>
+      <w:r>
+        <w:rPr>
+          <w:rFonts w:ascii="Courier New" w:hAnsi="Courier New"/>
+          <w:sz w:val="18"/>
+          <w:lang w:val="ru-RU"/>
+        </w:rPr>
+        <w:t>.</w:t>
+      </w:r>
+      <w:r>
+        <w:rPr>
+          <w:rFonts w:ascii="Courier New" w:hAnsi="Courier New"/>
+          <w:sz w:val="18"/>
+        </w:rPr>
+        <w:t>Tasks</w:t>
+      </w:r>
+      <w:r>
+        <w:rPr>
+          <w:rFonts w:ascii="Courier New" w:hAnsi="Courier New"/>
+          <w:sz w:val="18"/>
+          <w:lang w:val="ru-RU"/>
+        </w:rPr>
+        <w:t>;</w:t>
+      </w:r>
+      <w:r>
+        <w:rPr>
+          <w:rFonts w:ascii="Courier New" w:hAnsi="Courier New"/>
+          <w:sz w:val="18"/>
+          <w:lang w:val="ru-RU"/>
         </w:rPr>
         <w:br/>
-        <w:t>using System.Windows.Forms;</w:t>
-      </w:r>
-      <w:r>
-        <w:rPr>
-          <w:rFonts w:ascii="Courier New" w:hAnsi="Courier New"/>
-          <w:sz w:val="18"/>
+      </w:r>
+      <w:r>
+        <w:rPr>
+          <w:rFonts w:ascii="Courier New" w:hAnsi="Courier New"/>
+          <w:sz w:val="18"/>
+        </w:rPr>
+        <w:t>using</w:t>
+      </w:r>
+      <w:r>
+        <w:rPr>
+          <w:rFonts w:ascii="Courier New" w:hAnsi="Courier New"/>
+          <w:sz w:val="18"/>
+          <w:lang w:val="ru-RU"/>
+        </w:rPr>
+        <w:t xml:space="preserve"> </w:t>
+      </w:r>
+      <w:r>
+        <w:rPr>
+          <w:rFonts w:ascii="Courier New" w:hAnsi="Courier New"/>
+          <w:sz w:val="18"/>
+        </w:rPr>
+        <w:t>System</w:t>
+      </w:r>
+      <w:r>
+        <w:rPr>
+          <w:rFonts w:ascii="Courier New" w:hAnsi="Courier New"/>
+          <w:sz w:val="18"/>
+          <w:lang w:val="ru-RU"/>
+        </w:rPr>
+        <w:t>.</w:t>
+      </w:r>
+      <w:r>
+        <w:rPr>
+          <w:rFonts w:ascii="Courier New" w:hAnsi="Courier New"/>
+          <w:sz w:val="18"/>
+        </w:rPr>
+        <w:t>Windows</w:t>
+      </w:r>
+      <w:r>
+        <w:rPr>
+          <w:rFonts w:ascii="Courier New" w:hAnsi="Courier New"/>
+          <w:sz w:val="18"/>
+          <w:lang w:val="ru-RU"/>
+        </w:rPr>
+        <w:t>.</w:t>
+      </w:r>
+      <w:r>
+        <w:rPr>
+          <w:rFonts w:ascii="Courier New" w:hAnsi="Courier New"/>
+          <w:sz w:val="18"/>
+        </w:rPr>
+        <w:t>Forms</w:t>
+      </w:r>
+      <w:r>
+        <w:rPr>
+          <w:rFonts w:ascii="Courier New" w:hAnsi="Courier New"/>
+          <w:sz w:val="18"/>
+          <w:lang w:val="ru-RU"/>
+        </w:rPr>
+        <w:t>;</w:t>
+      </w:r>
+      <w:r>
+        <w:rPr>
+          <w:rFonts w:ascii="Courier New" w:hAnsi="Courier New"/>
+          <w:sz w:val="18"/>
+          <w:lang w:val="ru-RU"/>
         </w:rPr>
         <w:br/>
       </w:r>
@@ -4403,14 +6496,47 @@
         <w:rPr>
           <w:rFonts w:ascii="Courier New" w:hAnsi="Courier New"/>
           <w:sz w:val="18"/>
+          <w:lang w:val="ru-RU"/>
         </w:rPr>
         <w:br/>
-        <w:t>namespace lr4</w:t>
-      </w:r>
-      <w:r>
-        <w:rPr>
-          <w:rFonts w:ascii="Courier New" w:hAnsi="Courier New"/>
-          <w:sz w:val="18"/>
+      </w:r>
+      <w:r>
+        <w:rPr>
+          <w:rFonts w:ascii="Courier New" w:hAnsi="Courier New"/>
+          <w:sz w:val="18"/>
+        </w:rPr>
+        <w:t>namespace</w:t>
+      </w:r>
+      <w:r>
+        <w:rPr>
+          <w:rFonts w:ascii="Courier New" w:hAnsi="Courier New"/>
+          <w:sz w:val="18"/>
+          <w:lang w:val="ru-RU"/>
+        </w:rPr>
+        <w:t xml:space="preserve"> </w:t>
+      </w:r>
+      <w:proofErr w:type="spellStart"/>
+      <w:r>
+        <w:rPr>
+          <w:rFonts w:ascii="Courier New" w:hAnsi="Courier New"/>
+          <w:sz w:val="18"/>
+        </w:rPr>
+        <w:t>lr</w:t>
+      </w:r>
+      <w:proofErr w:type="spellEnd"/>
+      <w:r>
+        <w:rPr>
+          <w:rFonts w:ascii="Courier New" w:hAnsi="Courier New"/>
+          <w:sz w:val="18"/>
+          <w:lang w:val="ru-RU"/>
+        </w:rPr>
+        <w:t>4</w:t>
+      </w:r>
+      <w:r>
+        <w:rPr>
+          <w:rFonts w:ascii="Courier New" w:hAnsi="Courier New"/>
+          <w:sz w:val="18"/>
+          <w:lang w:val="ru-RU"/>
         </w:rPr>
         <w:br/>
         <w:t>{</w:t>
@@ -4419,14 +6545,31 @@
         <w:rPr>
           <w:rFonts w:ascii="Courier New" w:hAnsi="Courier New"/>
           <w:sz w:val="18"/>
+          <w:lang w:val="ru-RU"/>
         </w:rPr>
         <w:br/>
-        <w:t xml:space="preserve">    /// &lt;summary&gt;</w:t>
-      </w:r>
-      <w:r>
-        <w:rPr>
-          <w:rFonts w:ascii="Courier New" w:hAnsi="Courier New"/>
-          <w:sz w:val="18"/>
+        <w:t xml:space="preserve">    /// &lt;</w:t>
+      </w:r>
+      <w:r>
+        <w:rPr>
+          <w:rFonts w:ascii="Courier New" w:hAnsi="Courier New"/>
+          <w:sz w:val="18"/>
+        </w:rPr>
+        <w:t>summary</w:t>
+      </w:r>
+      <w:r>
+        <w:rPr>
+          <w:rFonts w:ascii="Courier New" w:hAnsi="Courier New"/>
+          <w:sz w:val="18"/>
+          <w:lang w:val="ru-RU"/>
+        </w:rPr>
+        <w:t>&gt;</w:t>
+      </w:r>
+      <w:r>
+        <w:rPr>
+          <w:rFonts w:ascii="Courier New" w:hAnsi="Courier New"/>
+          <w:sz w:val="18"/>
+          <w:lang w:val="ru-RU"/>
         </w:rPr>
         <w:br/>
         <w:t xml:space="preserve">    /// Главный класс приложения (точка входа)</w:t>
@@ -4435,22 +6578,92 @@
         <w:rPr>
           <w:rFonts w:ascii="Courier New" w:hAnsi="Courier New"/>
           <w:sz w:val="18"/>
+          <w:lang w:val="ru-RU"/>
         </w:rPr>
         <w:br/>
-        <w:t xml:space="preserve">    /// &lt;/summary&gt;</w:t>
-      </w:r>
-      <w:r>
-        <w:rPr>
-          <w:rFonts w:ascii="Courier New" w:hAnsi="Courier New"/>
-          <w:sz w:val="18"/>
+        <w:t xml:space="preserve">    /// &lt;/</w:t>
+      </w:r>
+      <w:r>
+        <w:rPr>
+          <w:rFonts w:ascii="Courier New" w:hAnsi="Courier New"/>
+          <w:sz w:val="18"/>
+        </w:rPr>
+        <w:t>summary</w:t>
+      </w:r>
+      <w:r>
+        <w:rPr>
+          <w:rFonts w:ascii="Courier New" w:hAnsi="Courier New"/>
+          <w:sz w:val="18"/>
+          <w:lang w:val="ru-RU"/>
+        </w:rPr>
+        <w:t>&gt;</w:t>
+      </w:r>
+      <w:r>
+        <w:rPr>
+          <w:rFonts w:ascii="Courier New" w:hAnsi="Courier New"/>
+          <w:sz w:val="18"/>
+          <w:lang w:val="ru-RU"/>
         </w:rPr>
         <w:br/>
-        <w:t xml:space="preserve">    internal static class Program</w:t>
-      </w:r>
-      <w:r>
-        <w:rPr>
-          <w:rFonts w:ascii="Courier New" w:hAnsi="Courier New"/>
-          <w:sz w:val="18"/>
+        <w:t xml:space="preserve">    </w:t>
+      </w:r>
+      <w:r>
+        <w:rPr>
+          <w:rFonts w:ascii="Courier New" w:hAnsi="Courier New"/>
+          <w:sz w:val="18"/>
+        </w:rPr>
+        <w:t>internal</w:t>
+      </w:r>
+      <w:r>
+        <w:rPr>
+          <w:rFonts w:ascii="Courier New" w:hAnsi="Courier New"/>
+          <w:sz w:val="18"/>
+          <w:lang w:val="ru-RU"/>
+        </w:rPr>
+        <w:t xml:space="preserve"> </w:t>
+      </w:r>
+      <w:r>
+        <w:rPr>
+          <w:rFonts w:ascii="Courier New" w:hAnsi="Courier New"/>
+          <w:sz w:val="18"/>
+        </w:rPr>
+        <w:t>static</w:t>
+      </w:r>
+      <w:r>
+        <w:rPr>
+          <w:rFonts w:ascii="Courier New" w:hAnsi="Courier New"/>
+          <w:sz w:val="18"/>
+          <w:lang w:val="ru-RU"/>
+        </w:rPr>
+        <w:t xml:space="preserve"> </w:t>
+      </w:r>
+      <w:r>
+        <w:rPr>
+          <w:rFonts w:ascii="Courier New" w:hAnsi="Courier New"/>
+          <w:sz w:val="18"/>
+        </w:rPr>
+        <w:t>class</w:t>
+      </w:r>
+      <w:r>
+        <w:rPr>
+          <w:rFonts w:ascii="Courier New" w:hAnsi="Courier New"/>
+          <w:sz w:val="18"/>
+          <w:lang w:val="ru-RU"/>
+        </w:rPr>
+        <w:t xml:space="preserve"> </w:t>
+      </w:r>
+      <w:r>
+        <w:rPr>
+          <w:rFonts w:ascii="Courier New" w:hAnsi="Courier New"/>
+          <w:sz w:val="18"/>
+        </w:rPr>
+        <w:t>Program</w:t>
+      </w:r>
+      <w:r>
+        <w:rPr>
+          <w:rFonts w:ascii="Courier New" w:hAnsi="Courier New"/>
+          <w:sz w:val="18"/>
+          <w:lang w:val="ru-RU"/>
         </w:rPr>
         <w:br/>
         <w:t xml:space="preserve">    {</w:t>
@@ -4459,14 +6672,31 @@
         <w:rPr>
           <w:rFonts w:ascii="Courier New" w:hAnsi="Courier New"/>
           <w:sz w:val="18"/>
+          <w:lang w:val="ru-RU"/>
         </w:rPr>
         <w:br/>
-        <w:t xml:space="preserve">        /// &lt;summary&gt;</w:t>
-      </w:r>
-      <w:r>
-        <w:rPr>
-          <w:rFonts w:ascii="Courier New" w:hAnsi="Courier New"/>
-          <w:sz w:val="18"/>
+        <w:t xml:space="preserve">        /// &lt;</w:t>
+      </w:r>
+      <w:r>
+        <w:rPr>
+          <w:rFonts w:ascii="Courier New" w:hAnsi="Courier New"/>
+          <w:sz w:val="18"/>
+        </w:rPr>
+        <w:t>summary</w:t>
+      </w:r>
+      <w:r>
+        <w:rPr>
+          <w:rFonts w:ascii="Courier New" w:hAnsi="Courier New"/>
+          <w:sz w:val="18"/>
+          <w:lang w:val="ru-RU"/>
+        </w:rPr>
+        <w:t>&gt;</w:t>
+      </w:r>
+      <w:r>
+        <w:rPr>
+          <w:rFonts w:ascii="Courier New" w:hAnsi="Courier New"/>
+          <w:sz w:val="18"/>
+          <w:lang w:val="ru-RU"/>
         </w:rPr>
         <w:br/>
         <w:t xml:space="preserve">        /// Главная точка входа для приложения.</w:t>
@@ -4475,9 +6705,17 @@
         <w:rPr>
           <w:rFonts w:ascii="Courier New" w:hAnsi="Courier New"/>
           <w:sz w:val="18"/>
+          <w:lang w:val="ru-RU"/>
         </w:rPr>
         <w:br/>
-        <w:t xml:space="preserve">        /// &lt;/summary&gt;</w:t>
+        <w:t xml:space="preserve">        </w:t>
+      </w:r>
+      <w:r>
+        <w:rPr>
+          <w:rFonts w:ascii="Courier New" w:hAnsi="Courier New"/>
+          <w:sz w:val="18"/>
+        </w:rPr>
+        <w:t>/// &lt;/summary&gt;</w:t>
       </w:r>
       <w:r>
         <w:rPr>

</xml_diff>